<commit_message>
Updated Documentation & ReadMe file
</commit_message>
<xml_diff>
--- a/Image_Reconstruction_Classifier/Documentation/ML 24-25-01 Investigate Image Reconstruction By using Classifier.docx
+++ b/Image_Reconstruction_Classifier/Documentation/ML 24-25-01 Investigate Image Reconstruction By using Classifier.docx
@@ -58,7 +58,23 @@
           <w:sz w:val="18"/>
           <w:szCs w:val="18"/>
         </w:rPr>
-        <w:t>Eyad Salah Elsheita </w:t>
+        <w:t xml:space="preserve">Eyad Salah </w:t>
+      </w:r>
+      <w:proofErr w:type="spellStart"/>
+      <w:r>
+        <w:rPr>
+          <w:sz w:val="18"/>
+          <w:szCs w:val="18"/>
+        </w:rPr>
+        <w:t>Elsheita</w:t>
+      </w:r>
+      <w:proofErr w:type="spellEnd"/>
+      <w:r>
+        <w:rPr>
+          <w:sz w:val="18"/>
+          <w:szCs w:val="18"/>
+        </w:rPr>
+        <w:t> </w:t>
       </w:r>
     </w:p>
     <w:p>
@@ -153,7 +169,16 @@
           <w:sz w:val="18"/>
           <w:szCs w:val="18"/>
         </w:rPr>
-        <w:t xml:space="preserve"> API for SDR generation, this methodology optimizes storage efficiency without compromising image fidelity. The proposed approach has the potential to revolutionize cloud storage, AI-powered image enhancement, and digital content management by offering an ultra-efficient yet accurate image compression and retrieval system.</w:t>
+        <w:t xml:space="preserve"> API for SDR generation, this methodology optimizes storage efficiency without compromising image fidelity. The proposed approach has the potential to revolutionize cloud storage, AI-powered image enhancement, and digital content management by offering an ultra-efficient yet accurate image compression and retrieval </w:t>
+      </w:r>
+      <w:proofErr w:type="gramStart"/>
+      <w:r>
+        <w:rPr>
+          <w:rFonts w:ascii="Times New Roman" w:eastAsia="Times New Roman" w:hAnsi="Times New Roman" w:cs="Times New Roman"/>
+          <w:sz w:val="18"/>
+          <w:szCs w:val="18"/>
+        </w:rPr>
+        <w:t>system.</w:t>
       </w:r>
       <w:r>
         <w:rPr>
@@ -163,6 +188,7 @@
         </w:rPr>
         <w:t>.</w:t>
       </w:r>
+      <w:proofErr w:type="gramEnd"/>
     </w:p>
     <w:p>
       <w:pPr>
@@ -191,20 +217,7 @@
           <w:sz w:val="20"/>
           <w:szCs w:val="20"/>
         </w:rPr>
-        <w:t xml:space="preserve">I. </w:t>
-      </w:r>
-      <w:r>
-        <w:rPr>
-          <w:rFonts w:ascii="Times New Roman" w:eastAsia="Times New Roman" w:hAnsi="Times New Roman" w:cs="Times New Roman"/>
-          <w:b/>
-          <w:bCs/>
-          <w:i/>
-          <w:iCs/>
-          <w:color w:val="000000" w:themeColor="text1"/>
-          <w:sz w:val="20"/>
-          <w:szCs w:val="20"/>
-        </w:rPr>
-        <w:t>Introduction</w:t>
+        <w:t>I. Introduction</w:t>
       </w:r>
     </w:p>
     <w:p>
@@ -277,23 +290,7 @@
           <w:sz w:val="18"/>
           <w:szCs w:val="18"/>
         </w:rPr>
-        <w:t xml:space="preserve">Spatial Pooler is “method which built on the architecture of neocortex and trying to model the process of how human brain handles the information about vision, audio, </w:t>
-      </w:r>
-      <w:r>
-        <w:rPr>
-          <w:rFonts w:ascii="Times New Roman" w:eastAsia="Times New Roman" w:hAnsi="Times New Roman" w:cs="Times New Roman"/>
-          <w:sz w:val="18"/>
-          <w:szCs w:val="18"/>
-        </w:rPr>
-        <w:t>behavior</w:t>
-      </w:r>
-      <w:r>
-        <w:rPr>
-          <w:rFonts w:ascii="Times New Roman" w:eastAsia="Times New Roman" w:hAnsi="Times New Roman" w:cs="Times New Roman"/>
-          <w:sz w:val="18"/>
-          <w:szCs w:val="18"/>
-        </w:rPr>
-        <w:t xml:space="preserve"> </w:t>
+        <w:t xml:space="preserve">Spatial Pooler is “method which built on the architecture of neocortex and trying to model the process of how human brain handles the information about vision, audio, behavior </w:t>
       </w:r>
       <w:proofErr w:type="spellStart"/>
       <w:r>
@@ -351,7 +348,43 @@
           <w:sz w:val="18"/>
           <w:szCs w:val="18"/>
         </w:rPr>
-        <w:t xml:space="preserve">. Spatial Pooler consist of “networks that continuously encodes streams of inputs into SDRs” [3]. ”The term “spatial pooler” is used because input patterns that share a large number of co-active neurons (i.e., that are spatially similar) are grouped together into a common output representation” </w:t>
+        <w:t xml:space="preserve">. Spatial Pooler </w:t>
+      </w:r>
+      <w:proofErr w:type="gramStart"/>
+      <w:r>
+        <w:rPr>
+          <w:rFonts w:ascii="Times New Roman" w:eastAsia="Times New Roman" w:hAnsi="Times New Roman" w:cs="Times New Roman"/>
+          <w:sz w:val="18"/>
+          <w:szCs w:val="18"/>
+        </w:rPr>
+        <w:t>consist</w:t>
+      </w:r>
+      <w:proofErr w:type="gramEnd"/>
+      <w:r>
+        <w:rPr>
+          <w:rFonts w:ascii="Times New Roman" w:eastAsia="Times New Roman" w:hAnsi="Times New Roman" w:cs="Times New Roman"/>
+          <w:sz w:val="18"/>
+          <w:szCs w:val="18"/>
+        </w:rPr>
+        <w:t xml:space="preserve"> of “networks that continuously encodes streams of inputs into SDRs” [3]. </w:t>
+      </w:r>
+      <w:proofErr w:type="gramStart"/>
+      <w:r>
+        <w:rPr>
+          <w:rFonts w:ascii="Times New Roman" w:eastAsia="Times New Roman" w:hAnsi="Times New Roman" w:cs="Times New Roman"/>
+          <w:sz w:val="18"/>
+          <w:szCs w:val="18"/>
+        </w:rPr>
+        <w:t>”The</w:t>
+      </w:r>
+      <w:proofErr w:type="gramEnd"/>
+      <w:r>
+        <w:rPr>
+          <w:rFonts w:ascii="Times New Roman" w:eastAsia="Times New Roman" w:hAnsi="Times New Roman" w:cs="Times New Roman"/>
+          <w:sz w:val="18"/>
+          <w:szCs w:val="18"/>
+        </w:rPr>
+        <w:t xml:space="preserve"> term “spatial pooler” is used because input patterns that share a large number of co-active neurons (i.e., that are spatially similar) are grouped together into a common output representation” </w:t>
       </w:r>
       <w:r>
         <w:rPr>
@@ -401,7 +434,7 @@
           <w:noProof/>
         </w:rPr>
         <w:drawing>
-          <wp:inline distT="0" distB="0" distL="0" distR="0" wp14:anchorId="6D61623F" wp14:editId="58B31FB8">
+          <wp:inline distT="0" distB="0" distL="0" distR="0" wp14:anchorId="6506E214" wp14:editId="541C187E">
             <wp:extent cx="3048000" cy="2538942"/>
             <wp:effectExtent l="0" t="0" r="0" b="0"/>
             <wp:docPr id="1402384325" name="Picture 1402384325"/>
@@ -448,7 +481,7 @@
           <w:sz w:val="16"/>
           <w:szCs w:val="16"/>
         </w:rPr>
-        <w:t xml:space="preserve">Fig.1 The spatial pooler converts inputs (bottom) to SDRs (top). Each SP mini-column forms synaptic connections to a subset of the input space (gray </w:t>
+        <w:t>Fig.1 The spatial pooler converts inputs (bottom) to SDRs (top). Each SP mini-column forms synaptic connections to a subset of the input space (gray square</w:t>
       </w:r>
       <w:r>
         <w:rPr>
@@ -456,7 +489,7 @@
           <w:sz w:val="16"/>
           <w:szCs w:val="16"/>
         </w:rPr>
-        <w:t>square</w:t>
+        <w:t>,</w:t>
       </w:r>
       <w:r>
         <w:rPr>
@@ -464,7 +497,7 @@
           <w:sz w:val="16"/>
           <w:szCs w:val="16"/>
         </w:rPr>
-        <w:t>,</w:t>
+        <w:t xml:space="preserve"> potential connections). (This figure is quoted from the reference </w:t>
       </w:r>
       <w:r>
         <w:rPr>
@@ -472,15 +505,39 @@
           <w:sz w:val="16"/>
           <w:szCs w:val="16"/>
         </w:rPr>
-        <w:t xml:space="preserve"> potential</w:t>
-      </w:r>
-      <w:r>
-        <w:rPr>
-          <w:rFonts w:ascii="Times New Roman" w:eastAsia="Times New Roman" w:hAnsi="Times New Roman" w:cs="Times New Roman"/>
-          <w:sz w:val="16"/>
-          <w:szCs w:val="16"/>
-        </w:rPr>
-        <w:t xml:space="preserve"> connections). (This figure is quoted from the reference [3])</w:t>
+        <w:t>(</w:t>
+      </w:r>
+      <w:r>
+        <w:rPr>
+          <w:rFonts w:ascii="Times New Roman" w:eastAsia="Times New Roman" w:hAnsi="Times New Roman" w:cs="Times New Roman"/>
+          <w:sz w:val="18"/>
+          <w:szCs w:val="18"/>
+        </w:rPr>
+        <w:t>Cui, Ahmad, &amp; Hawkins, 201</w:t>
+      </w:r>
+      <w:r>
+        <w:rPr>
+          <w:rFonts w:ascii="Times New Roman" w:eastAsia="Times New Roman" w:hAnsi="Times New Roman" w:cs="Times New Roman"/>
+          <w:sz w:val="18"/>
+          <w:szCs w:val="18"/>
+        </w:rPr>
+        <w:t>7</w:t>
+      </w:r>
+      <w:r>
+        <w:rPr>
+          <w:rFonts w:ascii="Times New Roman" w:eastAsia="Times New Roman" w:hAnsi="Times New Roman" w:cs="Times New Roman"/>
+          <w:sz w:val="18"/>
+          <w:szCs w:val="18"/>
+        </w:rPr>
+        <w:t xml:space="preserve">, p. </w:t>
+      </w:r>
+      <w:r>
+        <w:rPr>
+          <w:rFonts w:ascii="Times New Roman" w:eastAsia="Times New Roman" w:hAnsi="Times New Roman" w:cs="Times New Roman"/>
+          <w:sz w:val="18"/>
+          <w:szCs w:val="18"/>
+        </w:rPr>
+        <w:t>3))</w:t>
       </w:r>
     </w:p>
     <w:p>
@@ -566,23 +623,7 @@
           <w:sz w:val="18"/>
           <w:szCs w:val="18"/>
         </w:rPr>
-        <w:t xml:space="preserve">is a brain-inspired neural network model of </w:t>
-      </w:r>
-      <w:r>
-        <w:rPr>
-          <w:rFonts w:ascii="Times New Roman" w:eastAsia="Times New Roman" w:hAnsi="Times New Roman" w:cs="Times New Roman"/>
-          <w:sz w:val="18"/>
-          <w:szCs w:val="18"/>
-        </w:rPr>
-        <w:t>S</w:t>
-      </w:r>
-      <w:r>
-        <w:rPr>
-          <w:rFonts w:ascii="Times New Roman" w:eastAsia="Times New Roman" w:hAnsi="Times New Roman" w:cs="Times New Roman"/>
-          <w:sz w:val="18"/>
-          <w:szCs w:val="18"/>
-        </w:rPr>
-        <w:t>equence</w:t>
+        <w:t>is a brain-inspired neural network model of Sequence</w:t>
       </w:r>
       <w:r>
         <w:rPr>
@@ -614,6 +655,54 @@
           <w:sz w:val="18"/>
           <w:szCs w:val="18"/>
         </w:rPr>
+        <w:t xml:space="preserve"> (Cui, Surpur, Ahmad, &amp; Hawkins, 2016</w:t>
+      </w:r>
+      <w:r>
+        <w:rPr>
+          <w:rFonts w:ascii="Times New Roman" w:eastAsia="Times New Roman" w:hAnsi="Times New Roman" w:cs="Times New Roman"/>
+          <w:sz w:val="18"/>
+          <w:szCs w:val="18"/>
+        </w:rPr>
+        <w:t>, p. 1</w:t>
+      </w:r>
+      <w:r>
+        <w:rPr>
+          <w:rFonts w:ascii="Times New Roman" w:eastAsia="Times New Roman" w:hAnsi="Times New Roman" w:cs="Times New Roman"/>
+          <w:sz w:val="18"/>
+          <w:szCs w:val="18"/>
+        </w:rPr>
+        <w:t>)</w:t>
+      </w:r>
+      <w:r>
+        <w:rPr>
+          <w:rFonts w:ascii="Times New Roman" w:eastAsia="Times New Roman" w:hAnsi="Times New Roman" w:cs="Times New Roman"/>
+          <w:sz w:val="18"/>
+          <w:szCs w:val="18"/>
+        </w:rPr>
+        <w:t xml:space="preserve">. </w:t>
+      </w:r>
+      <w:r>
+        <w:rPr>
+          <w:rFonts w:ascii="Times New Roman" w:eastAsia="Times New Roman" w:hAnsi="Times New Roman" w:cs="Times New Roman"/>
+          <w:sz w:val="18"/>
+          <w:szCs w:val="18"/>
+        </w:rPr>
+        <w:t>HTM can model complex sequences using sparse distributed temporal codes.</w:t>
+      </w:r>
+      <w:r>
+        <w:rPr>
+          <w:rFonts w:ascii="Times New Roman" w:eastAsia="Times New Roman" w:hAnsi="Times New Roman" w:cs="Times New Roman"/>
+          <w:sz w:val="18"/>
+          <w:szCs w:val="18"/>
+        </w:rPr>
+        <w:t xml:space="preserve"> HTM</w:t>
+      </w:r>
+      <w:r>
+        <w:rPr>
+          <w:rFonts w:ascii="Times New Roman" w:eastAsia="Times New Roman" w:hAnsi="Times New Roman" w:cs="Times New Roman"/>
+          <w:sz w:val="18"/>
+          <w:szCs w:val="18"/>
+        </w:rPr>
         <w:t xml:space="preserve"> </w:t>
       </w:r>
       <w:r>
@@ -622,6 +711,46 @@
           <w:sz w:val="18"/>
           <w:szCs w:val="18"/>
         </w:rPr>
+        <w:t>“</w:t>
+      </w:r>
+      <w:r>
+        <w:rPr>
+          <w:rFonts w:ascii="Times New Roman" w:eastAsia="Times New Roman" w:hAnsi="Times New Roman" w:cs="Times New Roman"/>
+          <w:sz w:val="18"/>
+          <w:szCs w:val="18"/>
+        </w:rPr>
+        <w:t>is trained in real-time using an online unsupervised Hebbian</w:t>
+      </w:r>
+      <w:r>
+        <w:rPr>
+          <w:rFonts w:ascii="Times New Roman" w:eastAsia="Times New Roman" w:hAnsi="Times New Roman" w:cs="Times New Roman"/>
+          <w:sz w:val="18"/>
+          <w:szCs w:val="18"/>
+        </w:rPr>
+        <w:t xml:space="preserve"> </w:t>
+      </w:r>
+      <w:r>
+        <w:rPr>
+          <w:rFonts w:ascii="Times New Roman" w:eastAsia="Times New Roman" w:hAnsi="Times New Roman" w:cs="Times New Roman"/>
+          <w:sz w:val="18"/>
+          <w:szCs w:val="18"/>
+        </w:rPr>
+        <w:t>style learning</w:t>
+      </w:r>
+      <w:r>
+        <w:rPr>
+          <w:rFonts w:ascii="Times New Roman" w:eastAsia="Times New Roman" w:hAnsi="Times New Roman" w:cs="Times New Roman"/>
+          <w:sz w:val="18"/>
+          <w:szCs w:val="18"/>
+        </w:rPr>
+        <w:t xml:space="preserve">” </w:t>
+      </w:r>
+      <w:r>
+        <w:rPr>
+          <w:rFonts w:ascii="Times New Roman" w:eastAsia="Times New Roman" w:hAnsi="Times New Roman" w:cs="Times New Roman"/>
+          <w:sz w:val="18"/>
+          <w:szCs w:val="18"/>
+        </w:rPr>
         <w:t>(Cui, Surpur, Ahmad, &amp; Hawkins, 2016</w:t>
       </w:r>
       <w:r>
@@ -646,23 +775,31 @@
           <w:sz w:val="18"/>
           <w:szCs w:val="18"/>
         </w:rPr>
-        <w:t xml:space="preserve">. </w:t>
-      </w:r>
-      <w:r>
-        <w:rPr>
-          <w:rFonts w:ascii="Times New Roman" w:eastAsia="Times New Roman" w:hAnsi="Times New Roman" w:cs="Times New Roman"/>
-          <w:sz w:val="18"/>
-          <w:szCs w:val="18"/>
-        </w:rPr>
-        <w:t>HTM can model complex sequences using sparse distributed temporal codes.</w:t>
-      </w:r>
-      <w:r>
-        <w:rPr>
-          <w:rFonts w:ascii="Times New Roman" w:eastAsia="Times New Roman" w:hAnsi="Times New Roman" w:cs="Times New Roman"/>
-          <w:sz w:val="18"/>
-          <w:szCs w:val="18"/>
-        </w:rPr>
-        <w:t xml:space="preserve"> HTM</w:t>
+        <w:t>.</w:t>
+      </w:r>
+      <w:r>
+        <w:rPr>
+          <w:rFonts w:ascii="Times New Roman" w:eastAsia="Times New Roman" w:hAnsi="Times New Roman" w:cs="Times New Roman"/>
+          <w:sz w:val="18"/>
+          <w:szCs w:val="18"/>
+        </w:rPr>
+        <w:t xml:space="preserve"> The SDRs used in HTM possess a very large coding capacity and allow simultaneous representations of multiple predictions with minimal collisions.</w:t>
+      </w:r>
+      <w:r>
+        <w:rPr>
+          <w:rFonts w:ascii="Times New Roman" w:eastAsia="Times New Roman" w:hAnsi="Times New Roman" w:cs="Times New Roman"/>
+          <w:sz w:val="18"/>
+          <w:szCs w:val="18"/>
+        </w:rPr>
+        <w:t xml:space="preserve"> “</w:t>
+      </w:r>
+      <w:r>
+        <w:rPr>
+          <w:rFonts w:ascii="Times New Roman" w:eastAsia="Times New Roman" w:hAnsi="Times New Roman" w:cs="Times New Roman"/>
+          <w:sz w:val="18"/>
+          <w:szCs w:val="18"/>
+        </w:rPr>
+        <w:t>HTM</w:t>
       </w:r>
       <w:r>
         <w:rPr>
@@ -678,31 +815,7 @@
           <w:sz w:val="18"/>
           <w:szCs w:val="18"/>
         </w:rPr>
-        <w:t>“</w:t>
-      </w:r>
-      <w:r>
-        <w:rPr>
-          <w:rFonts w:ascii="Times New Roman" w:eastAsia="Times New Roman" w:hAnsi="Times New Roman" w:cs="Times New Roman"/>
-          <w:sz w:val="18"/>
-          <w:szCs w:val="18"/>
-        </w:rPr>
-        <w:t>is trained in real-time using an online unsupervised Hebbian</w:t>
-      </w:r>
-      <w:r>
-        <w:rPr>
-          <w:rFonts w:ascii="Times New Roman" w:eastAsia="Times New Roman" w:hAnsi="Times New Roman" w:cs="Times New Roman"/>
-          <w:sz w:val="18"/>
-          <w:szCs w:val="18"/>
-        </w:rPr>
-        <w:t xml:space="preserve"> </w:t>
-      </w:r>
-      <w:r>
-        <w:rPr>
-          <w:rFonts w:ascii="Times New Roman" w:eastAsia="Times New Roman" w:hAnsi="Times New Roman" w:cs="Times New Roman"/>
-          <w:sz w:val="18"/>
-          <w:szCs w:val="18"/>
-        </w:rPr>
-        <w:t>style learning</w:t>
+        <w:t>networks can learn complex sequences, rapidly adapt to changing statistics in the data, and naturally handle multiple predictions and branching sequences</w:t>
       </w:r>
       <w:r>
         <w:rPr>
@@ -726,127 +839,7 @@
           <w:sz w:val="18"/>
           <w:szCs w:val="18"/>
         </w:rPr>
-        <w:t>, p. 1</w:t>
-      </w:r>
-      <w:r>
-        <w:rPr>
-          <w:rFonts w:ascii="Times New Roman" w:eastAsia="Times New Roman" w:hAnsi="Times New Roman" w:cs="Times New Roman"/>
-          <w:sz w:val="18"/>
-          <w:szCs w:val="18"/>
-        </w:rPr>
-        <w:t>)</w:t>
-      </w:r>
-      <w:r>
-        <w:rPr>
-          <w:rFonts w:ascii="Times New Roman" w:eastAsia="Times New Roman" w:hAnsi="Times New Roman" w:cs="Times New Roman"/>
-          <w:sz w:val="18"/>
-          <w:szCs w:val="18"/>
-        </w:rPr>
-        <w:t>.</w:t>
-      </w:r>
-      <w:r>
-        <w:rPr>
-          <w:rFonts w:ascii="Times New Roman" w:eastAsia="Times New Roman" w:hAnsi="Times New Roman" w:cs="Times New Roman"/>
-          <w:sz w:val="18"/>
-          <w:szCs w:val="18"/>
-        </w:rPr>
-        <w:t xml:space="preserve"> The SDRs used in HTM possess a very large coding capacity and allow simultaneous representations of multiple predictions with minimal collisions.</w:t>
-      </w:r>
-      <w:r>
-        <w:rPr>
-          <w:rFonts w:ascii="Times New Roman" w:eastAsia="Times New Roman" w:hAnsi="Times New Roman" w:cs="Times New Roman"/>
-          <w:sz w:val="18"/>
-          <w:szCs w:val="18"/>
-        </w:rPr>
-        <w:t xml:space="preserve"> “</w:t>
-      </w:r>
-      <w:r>
-        <w:rPr>
-          <w:rFonts w:ascii="Times New Roman" w:eastAsia="Times New Roman" w:hAnsi="Times New Roman" w:cs="Times New Roman"/>
-          <w:sz w:val="18"/>
-          <w:szCs w:val="18"/>
-        </w:rPr>
-        <w:t>HTM</w:t>
-      </w:r>
-      <w:r>
-        <w:rPr>
-          <w:rFonts w:ascii="Times New Roman" w:eastAsia="Times New Roman" w:hAnsi="Times New Roman" w:cs="Times New Roman"/>
-          <w:sz w:val="18"/>
-          <w:szCs w:val="18"/>
-        </w:rPr>
-        <w:t xml:space="preserve"> </w:t>
-      </w:r>
-      <w:r>
-        <w:rPr>
-          <w:rFonts w:ascii="Times New Roman" w:eastAsia="Times New Roman" w:hAnsi="Times New Roman" w:cs="Times New Roman"/>
-          <w:sz w:val="18"/>
-          <w:szCs w:val="18"/>
-        </w:rPr>
-        <w:t>networks can learn complex sequences, rapidly adapt to changing statistics in the data, and naturally handle multiple predictions and branching sequences</w:t>
-      </w:r>
-      <w:r>
-        <w:rPr>
-          <w:rFonts w:ascii="Times New Roman" w:eastAsia="Times New Roman" w:hAnsi="Times New Roman" w:cs="Times New Roman"/>
-          <w:sz w:val="18"/>
-          <w:szCs w:val="18"/>
-        </w:rPr>
-        <w:t xml:space="preserve">” </w:t>
-      </w:r>
-      <w:r>
-        <w:rPr>
-          <w:rFonts w:ascii="Times New Roman" w:eastAsia="Times New Roman" w:hAnsi="Times New Roman" w:cs="Times New Roman"/>
-          <w:sz w:val="18"/>
-          <w:szCs w:val="18"/>
-        </w:rPr>
-        <w:t>(Cui, Surpur, Ahmad, &amp; Hawkins, 2016</w:t>
-      </w:r>
-      <w:r>
-        <w:rPr>
-          <w:rFonts w:ascii="Times New Roman" w:eastAsia="Times New Roman" w:hAnsi="Times New Roman" w:cs="Times New Roman"/>
-          <w:sz w:val="18"/>
-          <w:szCs w:val="18"/>
-        </w:rPr>
-        <w:t>, p. 1</w:t>
-      </w:r>
-      <w:r>
-        <w:rPr>
-          <w:rFonts w:ascii="Times New Roman" w:eastAsia="Times New Roman" w:hAnsi="Times New Roman" w:cs="Times New Roman"/>
-          <w:sz w:val="18"/>
-          <w:szCs w:val="18"/>
-        </w:rPr>
-        <w:t xml:space="preserve">). HTM </w:t>
-      </w:r>
-      <w:r>
-        <w:rPr>
-          <w:rFonts w:ascii="Times New Roman" w:eastAsia="Times New Roman" w:hAnsi="Times New Roman" w:cs="Times New Roman"/>
-          <w:sz w:val="18"/>
-          <w:szCs w:val="18"/>
-        </w:rPr>
-        <w:t>requires</w:t>
-      </w:r>
-      <w:r>
-        <w:rPr>
-          <w:rFonts w:ascii="Times New Roman" w:eastAsia="Times New Roman" w:hAnsi="Times New Roman" w:cs="Times New Roman"/>
-          <w:sz w:val="18"/>
-          <w:szCs w:val="18"/>
-        </w:rPr>
-        <w:t xml:space="preserve"> sparse distributed representation (</w:t>
-      </w:r>
-      <w:r>
-        <w:rPr>
-          <w:rFonts w:ascii="Times New Roman" w:eastAsia="Times New Roman" w:hAnsi="Times New Roman" w:cs="Times New Roman"/>
-          <w:sz w:val="18"/>
-          <w:szCs w:val="18"/>
-        </w:rPr>
-        <w:t>SDR) in</w:t>
-      </w:r>
-      <w:r>
-        <w:rPr>
-          <w:rFonts w:ascii="Times New Roman" w:eastAsia="Times New Roman" w:hAnsi="Times New Roman" w:cs="Times New Roman"/>
-          <w:sz w:val="18"/>
-          <w:szCs w:val="18"/>
-        </w:rPr>
-        <w:t xml:space="preserve"> its learning process.</w:t>
+        <w:t>, p. 1). HTM requires sparse distributed representation (SDR) in its learning process.</w:t>
       </w:r>
     </w:p>
     <w:p>
@@ -867,7 +860,7 @@
           <w:szCs w:val="18"/>
         </w:rPr>
         <w:drawing>
-          <wp:inline distT="0" distB="0" distL="0" distR="0" wp14:anchorId="255C5D13" wp14:editId="730785AA">
+          <wp:inline distT="0" distB="0" distL="0" distR="0" wp14:anchorId="54E483F2" wp14:editId="5DA6C383">
             <wp:extent cx="2743200" cy="508635"/>
             <wp:effectExtent l="0" t="0" r="0" b="5715"/>
             <wp:docPr id="583898064" name="Picture 1" descr="A logo of a computer chip&#10;&#10;AI-generated content may be incorrect."/>
@@ -911,53 +904,219 @@
     </w:p>
     <w:p>
       <w:pPr>
+        <w:jc w:val="both"/>
+        <w:rPr>
+          <w:rFonts w:ascii="Times New Roman" w:eastAsia="Times New Roman" w:hAnsi="Times New Roman" w:cs="Times New Roman"/>
+          <w:sz w:val="18"/>
+          <w:szCs w:val="18"/>
+        </w:rPr>
+      </w:pPr>
+      <w:r>
+        <w:rPr>
+          <w:rFonts w:ascii="Times New Roman" w:eastAsia="Times New Roman" w:hAnsi="Times New Roman" w:cs="Times New Roman"/>
+          <w:sz w:val="18"/>
+          <w:szCs w:val="18"/>
+        </w:rPr>
+        <w:t>Figure 2 Functional steps for using HTM on real-world sequence learning tasks</w:t>
+      </w:r>
+      <w:r>
+        <w:rPr>
+          <w:rFonts w:ascii="Times New Roman" w:eastAsia="Times New Roman" w:hAnsi="Times New Roman" w:cs="Times New Roman"/>
+          <w:sz w:val="18"/>
+          <w:szCs w:val="18"/>
+        </w:rPr>
+        <w:t xml:space="preserve"> </w:t>
+      </w:r>
+      <w:r>
+        <w:rPr>
+          <w:rFonts w:ascii="Times New Roman" w:eastAsia="Times New Roman" w:hAnsi="Times New Roman" w:cs="Times New Roman"/>
+          <w:sz w:val="16"/>
+          <w:szCs w:val="16"/>
+        </w:rPr>
+        <w:t xml:space="preserve">(This figure is quoted from the reference </w:t>
+      </w:r>
+      <w:r>
+        <w:rPr>
+          <w:rFonts w:ascii="Times New Roman" w:eastAsia="Times New Roman" w:hAnsi="Times New Roman" w:cs="Times New Roman"/>
+          <w:sz w:val="18"/>
+          <w:szCs w:val="18"/>
+        </w:rPr>
+        <w:t>(Cui, Surpur, Ahmad, &amp; Hawkins, 2016</w:t>
+      </w:r>
+      <w:r>
+        <w:rPr>
+          <w:rFonts w:ascii="Times New Roman" w:eastAsia="Times New Roman" w:hAnsi="Times New Roman" w:cs="Times New Roman"/>
+          <w:sz w:val="18"/>
+          <w:szCs w:val="18"/>
+        </w:rPr>
+        <w:t xml:space="preserve">, p. </w:t>
+      </w:r>
+      <w:r>
+        <w:rPr>
+          <w:rFonts w:ascii="Times New Roman" w:eastAsia="Times New Roman" w:hAnsi="Times New Roman" w:cs="Times New Roman"/>
+          <w:sz w:val="18"/>
+          <w:szCs w:val="18"/>
+        </w:rPr>
+        <w:t>1</w:t>
+      </w:r>
+      <w:r>
+        <w:rPr>
+          <w:rFonts w:ascii="Times New Roman" w:eastAsia="Times New Roman" w:hAnsi="Times New Roman" w:cs="Times New Roman"/>
+          <w:sz w:val="18"/>
+          <w:szCs w:val="18"/>
+        </w:rPr>
+        <w:t>)</w:t>
+      </w:r>
+      <w:r>
+        <w:rPr>
+          <w:rFonts w:ascii="Times New Roman" w:eastAsia="Times New Roman" w:hAnsi="Times New Roman" w:cs="Times New Roman"/>
+          <w:sz w:val="18"/>
+          <w:szCs w:val="18"/>
+        </w:rPr>
+        <w:t>)</w:t>
+      </w:r>
+      <w:r>
+        <w:rPr>
+          <w:rFonts w:ascii="Times New Roman" w:eastAsia="Times New Roman" w:hAnsi="Times New Roman" w:cs="Times New Roman"/>
+          <w:sz w:val="18"/>
+          <w:szCs w:val="18"/>
+        </w:rPr>
+        <w:t>.</w:t>
+      </w:r>
+    </w:p>
+    <w:p>
+      <w:pPr>
         <w:spacing w:line="276" w:lineRule="auto"/>
         <w:jc w:val="both"/>
         <w:rPr>
           <w:rFonts w:ascii="Times New Roman" w:eastAsia="Times New Roman" w:hAnsi="Times New Roman" w:cs="Times New Roman"/>
-          <w:sz w:val="16"/>
-          <w:szCs w:val="16"/>
-        </w:rPr>
-      </w:pPr>
-      <w:r>
-        <w:rPr>
-          <w:rFonts w:ascii="Times New Roman" w:eastAsia="Times New Roman" w:hAnsi="Times New Roman" w:cs="Times New Roman"/>
-          <w:sz w:val="18"/>
-          <w:szCs w:val="18"/>
-        </w:rPr>
-        <w:t>Figure 2 Functional steps for using HTM on real-world sequence learning tasks</w:t>
-      </w:r>
-      <w:r>
-        <w:rPr>
-          <w:rFonts w:ascii="Times New Roman" w:eastAsia="Times New Roman" w:hAnsi="Times New Roman" w:cs="Times New Roman"/>
-          <w:sz w:val="18"/>
-          <w:szCs w:val="18"/>
-        </w:rPr>
-        <w:t xml:space="preserve"> </w:t>
-      </w:r>
-      <w:r>
-        <w:rPr>
-          <w:rFonts w:ascii="Times New Roman" w:eastAsia="Times New Roman" w:hAnsi="Times New Roman" w:cs="Times New Roman"/>
-          <w:sz w:val="16"/>
-          <w:szCs w:val="16"/>
-        </w:rPr>
-        <w:t>(This figure is quoted from the reference [</w:t>
-      </w:r>
-      <w:r>
-        <w:rPr>
-          <w:rFonts w:ascii="Times New Roman" w:eastAsia="Times New Roman" w:hAnsi="Times New Roman" w:cs="Times New Roman"/>
-          <w:sz w:val="16"/>
-          <w:szCs w:val="16"/>
-        </w:rPr>
-        <w:t>4</w:t>
-      </w:r>
-      <w:r>
-        <w:rPr>
-          <w:rFonts w:ascii="Times New Roman" w:eastAsia="Times New Roman" w:hAnsi="Times New Roman" w:cs="Times New Roman"/>
-          <w:sz w:val="16"/>
-          <w:szCs w:val="16"/>
-        </w:rPr>
-        <w:t>])</w:t>
+          <w:sz w:val="18"/>
+          <w:szCs w:val="18"/>
+        </w:rPr>
+      </w:pPr>
+      <w:r>
+        <w:rPr>
+          <w:rFonts w:ascii="Times New Roman" w:eastAsia="Times New Roman" w:hAnsi="Times New Roman" w:cs="Times New Roman"/>
+          <w:sz w:val="18"/>
+          <w:szCs w:val="18"/>
+        </w:rPr>
+        <w:t xml:space="preserve">While the KNN is one of the simplest and most common classifiers, </w:t>
+      </w:r>
+      <w:r>
+        <w:rPr>
+          <w:rFonts w:ascii="Times New Roman" w:eastAsia="Times New Roman" w:hAnsi="Times New Roman" w:cs="Times New Roman"/>
+          <w:sz w:val="18"/>
+          <w:szCs w:val="18"/>
+        </w:rPr>
+        <w:t>“</w:t>
+      </w:r>
+      <w:r>
+        <w:rPr>
+          <w:rFonts w:ascii="Times New Roman" w:eastAsia="Times New Roman" w:hAnsi="Times New Roman" w:cs="Times New Roman"/>
+          <w:sz w:val="18"/>
+          <w:szCs w:val="18"/>
+        </w:rPr>
+        <w:t xml:space="preserve">yet its performance competes with the most complex classifiers in literature. The core of this classifier depends mainly on measuring the distance or similarity between the tested examples and the training examples” </w:t>
+      </w:r>
+      <w:r>
+        <w:rPr>
+          <w:rFonts w:ascii="Times New Roman" w:eastAsia="Times New Roman" w:hAnsi="Times New Roman" w:cs="Times New Roman"/>
+          <w:sz w:val="18"/>
+          <w:szCs w:val="18"/>
+        </w:rPr>
+        <w:t xml:space="preserve">(Abu </w:t>
+      </w:r>
+      <w:proofErr w:type="spellStart"/>
+      <w:r>
+        <w:rPr>
+          <w:rFonts w:ascii="Times New Roman" w:eastAsia="Times New Roman" w:hAnsi="Times New Roman" w:cs="Times New Roman"/>
+          <w:sz w:val="18"/>
+          <w:szCs w:val="18"/>
+        </w:rPr>
+        <w:t>Alfeilat</w:t>
+      </w:r>
+      <w:proofErr w:type="spellEnd"/>
+      <w:r>
+        <w:rPr>
+          <w:rFonts w:ascii="Times New Roman" w:eastAsia="Times New Roman" w:hAnsi="Times New Roman" w:cs="Times New Roman"/>
+          <w:sz w:val="18"/>
+          <w:szCs w:val="18"/>
+        </w:rPr>
+        <w:t xml:space="preserve"> et al., 2019</w:t>
+      </w:r>
+      <w:r>
+        <w:rPr>
+          <w:rFonts w:ascii="Times New Roman" w:eastAsia="Times New Roman" w:hAnsi="Times New Roman" w:cs="Times New Roman"/>
+          <w:sz w:val="18"/>
+          <w:szCs w:val="18"/>
+        </w:rPr>
+        <w:t>, p. 1</w:t>
+      </w:r>
+      <w:r>
+        <w:rPr>
+          <w:rFonts w:ascii="Times New Roman" w:eastAsia="Times New Roman" w:hAnsi="Times New Roman" w:cs="Times New Roman"/>
+          <w:sz w:val="18"/>
+          <w:szCs w:val="18"/>
+        </w:rPr>
+        <w:t>)</w:t>
+      </w:r>
+      <w:r>
+        <w:rPr>
+          <w:rFonts w:ascii="Times New Roman" w:eastAsia="Times New Roman" w:hAnsi="Times New Roman" w:cs="Times New Roman"/>
+          <w:sz w:val="18"/>
+          <w:szCs w:val="18"/>
+        </w:rPr>
+        <w:t xml:space="preserve">. The Classification part using the KNN part is depending on “unlabeled test sample based on the majority of similar samples among the k-nearest neighbors that are the closest to the test sample” </w:t>
+      </w:r>
+      <w:r>
+        <w:rPr>
+          <w:rFonts w:ascii="Times New Roman" w:eastAsia="Times New Roman" w:hAnsi="Times New Roman" w:cs="Times New Roman"/>
+          <w:sz w:val="18"/>
+          <w:szCs w:val="18"/>
+        </w:rPr>
+        <w:t xml:space="preserve">(Abu </w:t>
+      </w:r>
+      <w:proofErr w:type="spellStart"/>
+      <w:r>
+        <w:rPr>
+          <w:rFonts w:ascii="Times New Roman" w:eastAsia="Times New Roman" w:hAnsi="Times New Roman" w:cs="Times New Roman"/>
+          <w:sz w:val="18"/>
+          <w:szCs w:val="18"/>
+        </w:rPr>
+        <w:t>Alfeilat</w:t>
+      </w:r>
+      <w:proofErr w:type="spellEnd"/>
+      <w:r>
+        <w:rPr>
+          <w:rFonts w:ascii="Times New Roman" w:eastAsia="Times New Roman" w:hAnsi="Times New Roman" w:cs="Times New Roman"/>
+          <w:sz w:val="18"/>
+          <w:szCs w:val="18"/>
+        </w:rPr>
+        <w:t xml:space="preserve"> et al., 2019</w:t>
+      </w:r>
+      <w:r>
+        <w:rPr>
+          <w:rFonts w:ascii="Times New Roman" w:eastAsia="Times New Roman" w:hAnsi="Times New Roman" w:cs="Times New Roman"/>
+          <w:sz w:val="18"/>
+          <w:szCs w:val="18"/>
+        </w:rPr>
+        <w:t>, p. 4</w:t>
+      </w:r>
+      <w:r>
+        <w:rPr>
+          <w:rFonts w:ascii="Times New Roman" w:eastAsia="Times New Roman" w:hAnsi="Times New Roman" w:cs="Times New Roman"/>
+          <w:sz w:val="18"/>
+          <w:szCs w:val="18"/>
+        </w:rPr>
+        <w:t>)</w:t>
+      </w:r>
+      <w:r>
+        <w:rPr>
+          <w:rFonts w:ascii="Times New Roman" w:eastAsia="Times New Roman" w:hAnsi="Times New Roman" w:cs="Times New Roman"/>
+          <w:sz w:val="18"/>
+          <w:szCs w:val="18"/>
+        </w:rPr>
+        <w:t>.</w:t>
       </w:r>
     </w:p>
     <w:p>
@@ -970,138 +1129,6 @@
           <w:szCs w:val="18"/>
         </w:rPr>
       </w:pPr>
-      <w:r>
-        <w:rPr>
-          <w:rFonts w:ascii="Times New Roman" w:eastAsia="Times New Roman" w:hAnsi="Times New Roman" w:cs="Times New Roman"/>
-          <w:sz w:val="18"/>
-          <w:szCs w:val="18"/>
-        </w:rPr>
-        <w:t xml:space="preserve">While the KNN is one of the simplest and most common </w:t>
-      </w:r>
-      <w:r>
-        <w:rPr>
-          <w:rFonts w:ascii="Times New Roman" w:eastAsia="Times New Roman" w:hAnsi="Times New Roman" w:cs="Times New Roman"/>
-          <w:sz w:val="18"/>
-          <w:szCs w:val="18"/>
-        </w:rPr>
-        <w:t xml:space="preserve">classifiers, </w:t>
-      </w:r>
-      <w:r>
-        <w:rPr>
-          <w:rFonts w:ascii="Times New Roman" w:eastAsia="Times New Roman" w:hAnsi="Times New Roman" w:cs="Times New Roman"/>
-          <w:sz w:val="18"/>
-          <w:szCs w:val="18"/>
-        </w:rPr>
-        <w:t>“</w:t>
-      </w:r>
-      <w:r>
-        <w:rPr>
-          <w:rFonts w:ascii="Times New Roman" w:eastAsia="Times New Roman" w:hAnsi="Times New Roman" w:cs="Times New Roman"/>
-          <w:sz w:val="18"/>
-          <w:szCs w:val="18"/>
-        </w:rPr>
-        <w:t xml:space="preserve">yet its performance competes with the most complex classifiers in literature. The core of this classifier depends mainly on measuring the distance or similarity between the tested examples and the training examples” </w:t>
-      </w:r>
-      <w:r>
-        <w:rPr>
-          <w:rFonts w:ascii="Times New Roman" w:eastAsia="Times New Roman" w:hAnsi="Times New Roman" w:cs="Times New Roman"/>
-          <w:sz w:val="18"/>
-          <w:szCs w:val="18"/>
-        </w:rPr>
-        <w:t xml:space="preserve">(Abu </w:t>
-      </w:r>
-      <w:proofErr w:type="spellStart"/>
-      <w:r>
-        <w:rPr>
-          <w:rFonts w:ascii="Times New Roman" w:eastAsia="Times New Roman" w:hAnsi="Times New Roman" w:cs="Times New Roman"/>
-          <w:sz w:val="18"/>
-          <w:szCs w:val="18"/>
-        </w:rPr>
-        <w:t>Alfeilat</w:t>
-      </w:r>
-      <w:proofErr w:type="spellEnd"/>
-      <w:r>
-        <w:rPr>
-          <w:rFonts w:ascii="Times New Roman" w:eastAsia="Times New Roman" w:hAnsi="Times New Roman" w:cs="Times New Roman"/>
-          <w:sz w:val="18"/>
-          <w:szCs w:val="18"/>
-        </w:rPr>
-        <w:t xml:space="preserve"> et al., 2019</w:t>
-      </w:r>
-      <w:r>
-        <w:rPr>
-          <w:rFonts w:ascii="Times New Roman" w:eastAsia="Times New Roman" w:hAnsi="Times New Roman" w:cs="Times New Roman"/>
-          <w:sz w:val="18"/>
-          <w:szCs w:val="18"/>
-        </w:rPr>
-        <w:t>, p. 1</w:t>
-      </w:r>
-      <w:r>
-        <w:rPr>
-          <w:rFonts w:ascii="Times New Roman" w:eastAsia="Times New Roman" w:hAnsi="Times New Roman" w:cs="Times New Roman"/>
-          <w:sz w:val="18"/>
-          <w:szCs w:val="18"/>
-        </w:rPr>
-        <w:t>)</w:t>
-      </w:r>
-      <w:r>
-        <w:rPr>
-          <w:rFonts w:ascii="Times New Roman" w:eastAsia="Times New Roman" w:hAnsi="Times New Roman" w:cs="Times New Roman"/>
-          <w:sz w:val="18"/>
-          <w:szCs w:val="18"/>
-        </w:rPr>
-        <w:t xml:space="preserve">. The Classification part using the KNN part is depending on “unlabeled test sample based on the majority of similar samples among the k-nearest neighbors that are the closest to the test sample” </w:t>
-      </w:r>
-      <w:r>
-        <w:rPr>
-          <w:rFonts w:ascii="Times New Roman" w:eastAsia="Times New Roman" w:hAnsi="Times New Roman" w:cs="Times New Roman"/>
-          <w:sz w:val="18"/>
-          <w:szCs w:val="18"/>
-        </w:rPr>
-        <w:t xml:space="preserve">(Abu </w:t>
-      </w:r>
-      <w:proofErr w:type="spellStart"/>
-      <w:r>
-        <w:rPr>
-          <w:rFonts w:ascii="Times New Roman" w:eastAsia="Times New Roman" w:hAnsi="Times New Roman" w:cs="Times New Roman"/>
-          <w:sz w:val="18"/>
-          <w:szCs w:val="18"/>
-        </w:rPr>
-        <w:t>Alfeilat</w:t>
-      </w:r>
-      <w:proofErr w:type="spellEnd"/>
-      <w:r>
-        <w:rPr>
-          <w:rFonts w:ascii="Times New Roman" w:eastAsia="Times New Roman" w:hAnsi="Times New Roman" w:cs="Times New Roman"/>
-          <w:sz w:val="18"/>
-          <w:szCs w:val="18"/>
-        </w:rPr>
-        <w:t xml:space="preserve"> et al., 2019</w:t>
-      </w:r>
-      <w:r>
-        <w:rPr>
-          <w:rFonts w:ascii="Times New Roman" w:eastAsia="Times New Roman" w:hAnsi="Times New Roman" w:cs="Times New Roman"/>
-          <w:sz w:val="18"/>
-          <w:szCs w:val="18"/>
-        </w:rPr>
-        <w:t>, p. 4</w:t>
-      </w:r>
-      <w:r>
-        <w:rPr>
-          <w:rFonts w:ascii="Times New Roman" w:eastAsia="Times New Roman" w:hAnsi="Times New Roman" w:cs="Times New Roman"/>
-          <w:sz w:val="18"/>
-          <w:szCs w:val="18"/>
-        </w:rPr>
-        <w:t>)</w:t>
-      </w:r>
-      <w:r>
-        <w:rPr>
-          <w:rFonts w:ascii="Times New Roman" w:eastAsia="Times New Roman" w:hAnsi="Times New Roman" w:cs="Times New Roman"/>
-          <w:sz w:val="18"/>
-          <w:szCs w:val="18"/>
-        </w:rPr>
-        <w:t>.</w:t>
-      </w:r>
     </w:p>
     <w:p>
       <w:pPr>
@@ -1113,17 +1140,6 @@
           <w:szCs w:val="18"/>
         </w:rPr>
       </w:pPr>
-    </w:p>
-    <w:p>
-      <w:pPr>
-        <w:spacing w:line="276" w:lineRule="auto"/>
-        <w:jc w:val="both"/>
-        <w:rPr>
-          <w:rFonts w:ascii="Times New Roman" w:eastAsia="Times New Roman" w:hAnsi="Times New Roman" w:cs="Times New Roman"/>
-          <w:sz w:val="18"/>
-          <w:szCs w:val="18"/>
-        </w:rPr>
-      </w:pPr>
       <w:r>
         <w:rPr>
           <w:rFonts w:ascii="Times New Roman" w:eastAsia="Times New Roman" w:hAnsi="Times New Roman" w:cs="Times New Roman"/>
@@ -1146,23 +1162,7 @@
           <w:sz w:val="18"/>
           <w:szCs w:val="18"/>
         </w:rPr>
-        <w:t xml:space="preserve"> Image transformation </w:t>
-      </w:r>
-      <w:r>
-        <w:rPr>
-          <w:rFonts w:ascii="Times New Roman" w:eastAsia="Times New Roman" w:hAnsi="Times New Roman" w:cs="Times New Roman"/>
-          <w:sz w:val="18"/>
-          <w:szCs w:val="18"/>
-        </w:rPr>
-        <w:t>will</w:t>
-      </w:r>
-      <w:r>
-        <w:rPr>
-          <w:rFonts w:ascii="Times New Roman" w:eastAsia="Times New Roman" w:hAnsi="Times New Roman" w:cs="Times New Roman"/>
-          <w:sz w:val="18"/>
-          <w:szCs w:val="18"/>
-        </w:rPr>
-        <w:t xml:space="preserve"> be introduced. The full Process starting from </w:t>
+        <w:t xml:space="preserve"> Image transformation will be introduced. The full Process starting from </w:t>
       </w:r>
       <w:r>
         <w:rPr>
@@ -2194,13 +2194,23 @@
             <w:r>
               <w:br/>
             </w:r>
-            <w:r>
-              <w:rPr>
-                <w:rFonts w:ascii="Times New Roman" w:eastAsia="Times New Roman" w:hAnsi="Times New Roman" w:cs="Times New Roman"/>
-                <w:sz w:val="20"/>
-                <w:szCs w:val="20"/>
-              </w:rPr>
-              <w:t xml:space="preserve">string[] lines = </w:t>
+            <w:proofErr w:type="gramStart"/>
+            <w:r>
+              <w:rPr>
+                <w:rFonts w:ascii="Times New Roman" w:eastAsia="Times New Roman" w:hAnsi="Times New Roman" w:cs="Times New Roman"/>
+                <w:sz w:val="20"/>
+                <w:szCs w:val="20"/>
+              </w:rPr>
+              <w:t>string[</w:t>
+            </w:r>
+            <w:proofErr w:type="gramEnd"/>
+            <w:r>
+              <w:rPr>
+                <w:rFonts w:ascii="Times New Roman" w:eastAsia="Times New Roman" w:hAnsi="Times New Roman" w:cs="Times New Roman"/>
+                <w:sz w:val="20"/>
+                <w:szCs w:val="20"/>
+              </w:rPr>
+              <w:t xml:space="preserve">] lines = </w:t>
             </w:r>
             <w:proofErr w:type="spellStart"/>
             <w:r>
@@ -2301,7 +2311,25 @@
                 <w:sz w:val="20"/>
                 <w:szCs w:val="20"/>
               </w:rPr>
-              <w:t>(c =&gt; c == '1' ? 1 : 0)).</w:t>
+              <w:t xml:space="preserve">(c =&gt; c == '1' ? </w:t>
+            </w:r>
+            <w:proofErr w:type="gramStart"/>
+            <w:r>
+              <w:rPr>
+                <w:rFonts w:ascii="Times New Roman" w:eastAsia="Times New Roman" w:hAnsi="Times New Roman" w:cs="Times New Roman"/>
+                <w:sz w:val="20"/>
+                <w:szCs w:val="20"/>
+              </w:rPr>
+              <w:t>1 :</w:t>
+            </w:r>
+            <w:proofErr w:type="gramEnd"/>
+            <w:r>
+              <w:rPr>
+                <w:rFonts w:ascii="Times New Roman" w:eastAsia="Times New Roman" w:hAnsi="Times New Roman" w:cs="Times New Roman"/>
+                <w:sz w:val="20"/>
+                <w:szCs w:val="20"/>
+              </w:rPr>
+              <w:t xml:space="preserve"> 0)).</w:t>
             </w:r>
             <w:proofErr w:type="spellStart"/>
             <w:r>
@@ -2325,25 +2353,6 @@
         </w:tc>
       </w:tr>
     </w:tbl>
-    <w:p>
-      <w:pPr>
-        <w:spacing w:after="0"/>
-      </w:pPr>
-    </w:p>
-    <w:p>
-      <w:pPr>
-        <w:pStyle w:val="Heading4"/>
-        <w:spacing w:before="319" w:after="319" w:line="276" w:lineRule="auto"/>
-        <w:jc w:val="both"/>
-        <w:rPr>
-          <w:rFonts w:ascii="Times New Roman" w:eastAsia="Times New Roman" w:hAnsi="Times New Roman" w:cs="Times New Roman"/>
-          <w:b/>
-          <w:bCs/>
-          <w:sz w:val="20"/>
-          <w:szCs w:val="20"/>
-        </w:rPr>
-      </w:pPr>
-    </w:p>
     <w:p>
       <w:pPr>
         <w:pStyle w:val="Heading4"/>
@@ -2430,27 +2439,7 @@
           <w:sz w:val="18"/>
           <w:szCs w:val="18"/>
         </w:rPr>
-        <w:t>Initialization</w:t>
-      </w:r>
-      <w:r>
-        <w:rPr>
-          <w:rFonts w:ascii="Times New Roman" w:eastAsia="Times New Roman" w:hAnsi="Times New Roman" w:cs="Times New Roman"/>
-          <w:b/>
-          <w:bCs/>
-          <w:sz w:val="18"/>
-          <w:szCs w:val="18"/>
-        </w:rPr>
-        <w:t xml:space="preserve"> </w:t>
-      </w:r>
-      <w:r>
-        <w:rPr>
-          <w:rFonts w:ascii="Times New Roman" w:eastAsia="Times New Roman" w:hAnsi="Times New Roman" w:cs="Times New Roman"/>
-          <w:b/>
-          <w:bCs/>
-          <w:sz w:val="18"/>
-          <w:szCs w:val="18"/>
-        </w:rPr>
-        <w:t>and Execution:</w:t>
+        <w:t>Initialization and Execution:</w:t>
       </w:r>
       <w:r>
         <w:br/>
@@ -2556,6 +2545,7 @@
               <w:t xml:space="preserve"> = new </w:t>
             </w:r>
             <w:proofErr w:type="spellStart"/>
+            <w:proofErr w:type="gramStart"/>
             <w:r>
               <w:rPr>
                 <w:rFonts w:ascii="Times New Roman" w:eastAsia="Times New Roman" w:hAnsi="Times New Roman" w:cs="Times New Roman"/>
@@ -2571,7 +2561,16 @@
                 <w:sz w:val="20"/>
                 <w:szCs w:val="20"/>
               </w:rPr>
-              <w:t>();</w:t>
+              <w:t>(</w:t>
+            </w:r>
+            <w:proofErr w:type="gramEnd"/>
+            <w:r>
+              <w:rPr>
+                <w:rFonts w:ascii="Times New Roman" w:eastAsia="Times New Roman" w:hAnsi="Times New Roman" w:cs="Times New Roman"/>
+                <w:sz w:val="20"/>
+                <w:szCs w:val="20"/>
+              </w:rPr>
+              <w:t>);</w:t>
             </w:r>
             <w:r>
               <w:br/>
@@ -2801,7 +2800,17 @@
                 <w:sz w:val="20"/>
                 <w:szCs w:val="20"/>
               </w:rPr>
-              <w:t>295,397,445,471,521,528,529,541,546,559,611,627,629,634,660,661,678,681,687,692,696,697,702,717,718,721,730,731,739,751,754,761,769,771,775,782,783,784,788,789,790,791,792,798,802,810,814,817,834,846,859,1202,1349,1363,1429,1497,1724,1777,1849,1888,1949</w:t>
+              <w:t>295,397,445,471,521,528,529,541,546,559,611,627,629,634,660,661,678,681,687,692,696,697,702,717,718,721,730,731,739,751,754,761,769,771,775,782,783,784,788,789,790,791,792,798,802,810,81</w:t>
+            </w:r>
+            <w:r>
+              <w:rPr>
+                <w:rFonts w:ascii="Times New Roman" w:eastAsia="Times New Roman" w:hAnsi="Times New Roman" w:cs="Times New Roman"/>
+                <w:i/>
+                <w:iCs/>
+                <w:sz w:val="20"/>
+                <w:szCs w:val="20"/>
+              </w:rPr>
+              <w:t>4,817,834,846,859,1202,1349,1363,1429,1497,1724,1777,1849,1888,1949</w:t>
             </w:r>
           </w:p>
         </w:tc>
@@ -2872,6 +2881,17 @@
     </w:p>
     <w:p>
       <w:pPr>
+        <w:spacing w:after="0" w:line="276" w:lineRule="auto"/>
+        <w:jc w:val="both"/>
+        <w:rPr>
+          <w:rFonts w:ascii="Times New Roman" w:eastAsia="Times New Roman" w:hAnsi="Times New Roman" w:cs="Times New Roman"/>
+          <w:sz w:val="20"/>
+          <w:szCs w:val="20"/>
+        </w:rPr>
+      </w:pPr>
+    </w:p>
+    <w:p>
+      <w:pPr>
         <w:pStyle w:val="Heading4"/>
         <w:spacing w:before="319" w:after="319" w:line="276" w:lineRule="auto"/>
         <w:jc w:val="both"/>
@@ -2891,6 +2911,409 @@
           <w:sz w:val="20"/>
           <w:szCs w:val="20"/>
         </w:rPr>
+        <w:t>2.</w:t>
+      </w:r>
+      <w:r>
+        <w:rPr>
+          <w:rFonts w:ascii="Times New Roman" w:eastAsia="Times New Roman" w:hAnsi="Times New Roman" w:cs="Times New Roman"/>
+          <w:b/>
+          <w:bCs/>
+          <w:sz w:val="20"/>
+          <w:szCs w:val="20"/>
+        </w:rPr>
+        <w:t>1</w:t>
+      </w:r>
+      <w:r>
+        <w:rPr>
+          <w:rFonts w:ascii="Times New Roman" w:eastAsia="Times New Roman" w:hAnsi="Times New Roman" w:cs="Times New Roman"/>
+          <w:b/>
+          <w:bCs/>
+          <w:sz w:val="20"/>
+          <w:szCs w:val="20"/>
+        </w:rPr>
+        <w:t xml:space="preserve"> </w:t>
+      </w:r>
+      <w:r>
+        <w:rPr>
+          <w:rFonts w:ascii="Times New Roman" w:eastAsia="Times New Roman" w:hAnsi="Times New Roman" w:cs="Times New Roman"/>
+          <w:b/>
+          <w:bCs/>
+          <w:sz w:val="20"/>
+          <w:szCs w:val="20"/>
+        </w:rPr>
+        <w:t>Dual Sparse Representations in HTM</w:t>
+      </w:r>
+    </w:p>
+    <w:p>
+      <w:pPr>
+        <w:jc w:val="both"/>
+        <w:rPr>
+          <w:rFonts w:ascii="Times New Roman" w:eastAsia="Times New Roman" w:hAnsi="Times New Roman" w:cs="Times New Roman"/>
+          <w:sz w:val="18"/>
+          <w:szCs w:val="18"/>
+        </w:rPr>
+      </w:pPr>
+      <w:r>
+        <w:rPr>
+          <w:rFonts w:ascii="Times New Roman" w:eastAsia="Times New Roman" w:hAnsi="Times New Roman" w:cs="Times New Roman"/>
+          <w:noProof/>
+          <w:sz w:val="18"/>
+          <w:szCs w:val="18"/>
+        </w:rPr>
+        <w:drawing>
+          <wp:inline distT="0" distB="0" distL="0" distR="0" wp14:anchorId="0D16191C" wp14:editId="62C23A70">
+            <wp:extent cx="2743200" cy="838200"/>
+            <wp:effectExtent l="0" t="0" r="0" b="0"/>
+            <wp:docPr id="1352414175" name="Picture 1"/>
+            <wp:cNvGraphicFramePr>
+              <a:graphicFrameLocks xmlns:a="http://schemas.openxmlformats.org/drawingml/2006/main" noChangeAspect="1"/>
+            </wp:cNvGraphicFramePr>
+            <a:graphic xmlns:a="http://schemas.openxmlformats.org/drawingml/2006/main">
+              <a:graphicData uri="http://schemas.openxmlformats.org/drawingml/2006/picture">
+                <pic:pic xmlns:pic="http://schemas.openxmlformats.org/drawingml/2006/picture">
+                  <pic:nvPicPr>
+                    <pic:cNvPr id="1352414175" name="Picture 1352414175"/>
+                    <pic:cNvPicPr/>
+                  </pic:nvPicPr>
+                  <pic:blipFill>
+                    <a:blip r:embed="rId15">
+                      <a:extLst>
+                        <a:ext uri="{28A0092B-C50C-407E-A947-70E740481C1C}">
+                          <a14:useLocalDpi xmlns:a14="http://schemas.microsoft.com/office/drawing/2010/main" val="0"/>
+                        </a:ext>
+                      </a:extLst>
+                    </a:blip>
+                    <a:stretch>
+                      <a:fillRect/>
+                    </a:stretch>
+                  </pic:blipFill>
+                  <pic:spPr>
+                    <a:xfrm>
+                      <a:off x="0" y="0"/>
+                      <a:ext cx="2749251" cy="840049"/>
+                    </a:xfrm>
+                    <a:prstGeom prst="rect">
+                      <a:avLst/>
+                    </a:prstGeom>
+                  </pic:spPr>
+                </pic:pic>
+              </a:graphicData>
+            </a:graphic>
+          </wp:inline>
+        </w:drawing>
+      </w:r>
+    </w:p>
+    <w:p>
+      <w:pPr>
+        <w:jc w:val="both"/>
+        <w:rPr>
+          <w:rFonts w:ascii="Times New Roman" w:eastAsia="Times New Roman" w:hAnsi="Times New Roman" w:cs="Times New Roman"/>
+          <w:sz w:val="18"/>
+          <w:szCs w:val="18"/>
+        </w:rPr>
+      </w:pPr>
+      <w:r>
+        <w:rPr>
+          <w:rFonts w:ascii="Times New Roman" w:eastAsia="Times New Roman" w:hAnsi="Times New Roman" w:cs="Times New Roman"/>
+          <w:sz w:val="18"/>
+          <w:szCs w:val="18"/>
+        </w:rPr>
+        <w:t xml:space="preserve">Figure </w:t>
+      </w:r>
+      <w:r>
+        <w:rPr>
+          <w:rFonts w:ascii="Times New Roman" w:eastAsia="Times New Roman" w:hAnsi="Times New Roman" w:cs="Times New Roman"/>
+          <w:sz w:val="18"/>
+          <w:szCs w:val="18"/>
+        </w:rPr>
+        <w:t>3</w:t>
+      </w:r>
+      <w:r>
+        <w:rPr>
+          <w:rFonts w:ascii="Times New Roman" w:eastAsia="Times New Roman" w:hAnsi="Times New Roman" w:cs="Times New Roman"/>
+          <w:sz w:val="18"/>
+          <w:szCs w:val="18"/>
+        </w:rPr>
+        <w:t xml:space="preserve"> shows the HTM sequence memory model. Part A depicts an HTM neuron with three integration zones, where co-activation of distal synapses induces a predicted state. Part B contrasts the network's state before and after learning.</w:t>
+      </w:r>
+      <w:r>
+        <w:rPr>
+          <w:rFonts w:ascii="Times New Roman" w:eastAsia="Times New Roman" w:hAnsi="Times New Roman" w:cs="Times New Roman"/>
+          <w:sz w:val="18"/>
+          <w:szCs w:val="18"/>
+        </w:rPr>
+        <w:t xml:space="preserve"> </w:t>
+      </w:r>
+      <w:r>
+        <w:rPr>
+          <w:rFonts w:ascii="Times New Roman" w:eastAsia="Times New Roman" w:hAnsi="Times New Roman" w:cs="Times New Roman"/>
+          <w:sz w:val="16"/>
+          <w:szCs w:val="16"/>
+        </w:rPr>
+        <w:t xml:space="preserve">(This figure is quoted from the reference </w:t>
+      </w:r>
+      <w:r>
+        <w:rPr>
+          <w:rFonts w:ascii="Times New Roman" w:eastAsia="Times New Roman" w:hAnsi="Times New Roman" w:cs="Times New Roman"/>
+          <w:sz w:val="18"/>
+          <w:szCs w:val="18"/>
+        </w:rPr>
+        <w:t>(Cui, Surpur, Ahmad, &amp; Hawkins, 2016</w:t>
+      </w:r>
+      <w:r>
+        <w:rPr>
+          <w:rFonts w:ascii="Times New Roman" w:eastAsia="Times New Roman" w:hAnsi="Times New Roman" w:cs="Times New Roman"/>
+          <w:sz w:val="18"/>
+          <w:szCs w:val="18"/>
+        </w:rPr>
+        <w:t>, p. 3)</w:t>
+      </w:r>
+      <w:r>
+        <w:rPr>
+          <w:rFonts w:ascii="Times New Roman" w:eastAsia="Times New Roman" w:hAnsi="Times New Roman" w:cs="Times New Roman"/>
+          <w:sz w:val="18"/>
+          <w:szCs w:val="18"/>
+        </w:rPr>
+        <w:t>)</w:t>
+      </w:r>
+    </w:p>
+    <w:p>
+      <w:pPr>
+        <w:spacing w:line="276" w:lineRule="auto"/>
+        <w:jc w:val="both"/>
+        <w:rPr>
+          <w:rFonts w:ascii="Times New Roman" w:eastAsia="Times New Roman" w:hAnsi="Times New Roman" w:cs="Times New Roman"/>
+          <w:sz w:val="16"/>
+          <w:szCs w:val="16"/>
+        </w:rPr>
+      </w:pPr>
+    </w:p>
+    <w:p>
+      <w:pPr>
+        <w:jc w:val="both"/>
+        <w:rPr>
+          <w:rFonts w:ascii="Times New Roman" w:eastAsia="Times New Roman" w:hAnsi="Times New Roman" w:cs="Times New Roman"/>
+          <w:sz w:val="18"/>
+          <w:szCs w:val="18"/>
+        </w:rPr>
+      </w:pPr>
+      <w:r>
+        <w:rPr>
+          <w:rFonts w:ascii="Times New Roman" w:eastAsia="Times New Roman" w:hAnsi="Times New Roman" w:cs="Times New Roman"/>
+          <w:sz w:val="18"/>
+          <w:szCs w:val="18"/>
+        </w:rPr>
+        <w:t>Two separate sparse representations</w:t>
+      </w:r>
+      <w:r>
+        <w:rPr>
+          <w:rFonts w:ascii="Times New Roman" w:eastAsia="Times New Roman" w:hAnsi="Times New Roman" w:cs="Times New Roman"/>
+          <w:sz w:val="18"/>
+          <w:szCs w:val="18"/>
+        </w:rPr>
+        <w:t xml:space="preserve"> </w:t>
+      </w:r>
+      <w:r>
+        <w:rPr>
+          <w:rFonts w:ascii="Times New Roman" w:eastAsia="Times New Roman" w:hAnsi="Times New Roman" w:cs="Times New Roman"/>
+          <w:sz w:val="18"/>
+          <w:szCs w:val="18"/>
+        </w:rPr>
+        <w:t>The HTM network consists of a layer of HTM neurons organized into a set of columns (Fig. 1A). The network</w:t>
+      </w:r>
+      <w:r>
+        <w:rPr>
+          <w:rFonts w:ascii="Times New Roman" w:eastAsia="Times New Roman" w:hAnsi="Times New Roman" w:cs="Times New Roman"/>
+          <w:sz w:val="18"/>
+          <w:szCs w:val="18"/>
+        </w:rPr>
+        <w:t xml:space="preserve"> </w:t>
+      </w:r>
+      <w:r>
+        <w:rPr>
+          <w:rFonts w:ascii="Times New Roman" w:eastAsia="Times New Roman" w:hAnsi="Times New Roman" w:cs="Times New Roman"/>
+          <w:sz w:val="18"/>
+          <w:szCs w:val="18"/>
+        </w:rPr>
+        <w:t xml:space="preserve">represents high-order sequences using a composition of two separate sparse representations. The first representation is at the column level. All neurons within a column detect identical feed-forward input patterns. Each input element is encoded as a sparse distributed activation of columns at any point in time (Fig. 1B, blue arrows). This sparse set </w:t>
+      </w:r>
+      <w:r>
+        <w:rPr>
+          <w:rFonts w:ascii="Times New Roman" w:eastAsia="Times New Roman" w:hAnsi="Times New Roman" w:cs="Times New Roman"/>
+          <w:sz w:val="18"/>
+          <w:szCs w:val="18"/>
+        </w:rPr>
+        <w:t xml:space="preserve">of </w:t>
+      </w:r>
+      <w:r>
+        <w:rPr>
+          <w:rFonts w:ascii="Times New Roman" w:eastAsia="Times New Roman" w:hAnsi="Times New Roman" w:cs="Times New Roman"/>
+          <w:sz w:val="18"/>
+          <w:szCs w:val="18"/>
+        </w:rPr>
+        <w:t>columns</w:t>
+      </w:r>
+      <w:r>
+        <w:rPr>
+          <w:rFonts w:ascii="Times New Roman" w:eastAsia="Times New Roman" w:hAnsi="Times New Roman" w:cs="Times New Roman"/>
+          <w:sz w:val="18"/>
+          <w:szCs w:val="18"/>
+        </w:rPr>
+        <w:t xml:space="preserve"> is chosen according to a spatial competitive learning rule</w:t>
+      </w:r>
+      <w:r>
+        <w:rPr>
+          <w:rFonts w:ascii="Times New Roman" w:eastAsia="Times New Roman" w:hAnsi="Times New Roman" w:cs="Times New Roman"/>
+          <w:sz w:val="18"/>
+          <w:szCs w:val="18"/>
+        </w:rPr>
+        <w:t xml:space="preserve"> </w:t>
+      </w:r>
+      <w:r>
+        <w:rPr>
+          <w:rFonts w:ascii="Times New Roman" w:eastAsia="Times New Roman" w:hAnsi="Times New Roman" w:cs="Times New Roman"/>
+          <w:sz w:val="18"/>
+          <w:szCs w:val="18"/>
+        </w:rPr>
+        <w:t>(Cui, Surpur, Ahmad, &amp; Hawkins, 2016</w:t>
+      </w:r>
+      <w:r>
+        <w:rPr>
+          <w:rFonts w:ascii="Times New Roman" w:eastAsia="Times New Roman" w:hAnsi="Times New Roman" w:cs="Times New Roman"/>
+          <w:sz w:val="18"/>
+          <w:szCs w:val="18"/>
+        </w:rPr>
+        <w:t xml:space="preserve">, p. </w:t>
+      </w:r>
+      <w:r>
+        <w:rPr>
+          <w:rFonts w:ascii="Times New Roman" w:eastAsia="Times New Roman" w:hAnsi="Times New Roman" w:cs="Times New Roman"/>
+          <w:sz w:val="18"/>
+          <w:szCs w:val="18"/>
+        </w:rPr>
+        <w:t>3</w:t>
+      </w:r>
+      <w:r>
+        <w:rPr>
+          <w:rFonts w:ascii="Times New Roman" w:eastAsia="Times New Roman" w:hAnsi="Times New Roman" w:cs="Times New Roman"/>
+          <w:sz w:val="18"/>
+          <w:szCs w:val="18"/>
+        </w:rPr>
+        <w:t>).</w:t>
+      </w:r>
+    </w:p>
+    <w:p>
+      <w:pPr>
+        <w:jc w:val="both"/>
+        <w:rPr>
+          <w:rFonts w:ascii="Times New Roman" w:eastAsia="Times New Roman" w:hAnsi="Times New Roman" w:cs="Times New Roman"/>
+          <w:sz w:val="18"/>
+          <w:szCs w:val="18"/>
+        </w:rPr>
+      </w:pPr>
+      <w:r>
+        <w:rPr>
+          <w:rFonts w:ascii="Times New Roman" w:eastAsia="Times New Roman" w:hAnsi="Times New Roman" w:cs="Times New Roman"/>
+          <w:sz w:val="18"/>
+          <w:szCs w:val="18"/>
+        </w:rPr>
+        <w:t>The second representation is at the level of individual cells within these columns. After sequence learning (Fig. 1B, bottom), at any given time a distinct subset of cells in the active columns will represent information regarding the learned temporal context of the current pattern. These cells in turn lead to predictions of the upcoming input through lateral projections to other cells within the same network.</w:t>
+      </w:r>
+      <w:r>
+        <w:rPr>
+          <w:rFonts w:ascii="Times New Roman" w:eastAsia="Times New Roman" w:hAnsi="Times New Roman" w:cs="Times New Roman"/>
+          <w:sz w:val="18"/>
+          <w:szCs w:val="18"/>
+        </w:rPr>
+        <w:t xml:space="preserve"> </w:t>
+      </w:r>
+      <w:r>
+        <w:rPr>
+          <w:rFonts w:ascii="Times New Roman" w:eastAsia="Times New Roman" w:hAnsi="Times New Roman" w:cs="Times New Roman"/>
+          <w:sz w:val="18"/>
+          <w:szCs w:val="18"/>
+        </w:rPr>
+        <w:t>The predictive state of a cell controls inhibition within a column. If a cell is in the predicted state and later receives sufficient feed-forward input, it will become active faster and inhibit other cells within that column. If there were no cells in the predicted state for an active column, all cells within the column become active. This dual sparse</w:t>
+      </w:r>
+      <w:r>
+        <w:rPr>
+          <w:rFonts w:ascii="Times New Roman" w:eastAsia="Times New Roman" w:hAnsi="Times New Roman" w:cs="Times New Roman"/>
+          <w:sz w:val="18"/>
+          <w:szCs w:val="18"/>
+        </w:rPr>
+        <w:t xml:space="preserve"> </w:t>
+      </w:r>
+      <w:r>
+        <w:rPr>
+          <w:rFonts w:ascii="Times New Roman" w:eastAsia="Times New Roman" w:hAnsi="Times New Roman" w:cs="Times New Roman"/>
+          <w:sz w:val="18"/>
+          <w:szCs w:val="18"/>
+        </w:rPr>
+        <w:t xml:space="preserve">representation paradigm leads to a number of interesting properties. First, because information is stored by co-activation of multiple cells in a distributed manner, the model is naturally robust to both noise in the input and system faults such as loss of neurons and synapses. Second, </w:t>
+      </w:r>
+      <w:r>
+        <w:rPr>
+          <w:rFonts w:ascii="Times New Roman" w:eastAsia="Times New Roman" w:hAnsi="Times New Roman" w:cs="Times New Roman"/>
+          <w:sz w:val="18"/>
+          <w:szCs w:val="18"/>
+        </w:rPr>
+        <w:lastRenderedPageBreak/>
+        <w:t xml:space="preserve">the use of sparse representations allows the model to make multiple predictions simultaneously. For example, if we present an input to the network without any context, all cells in columns representing that input will fire, which then leads to a prediction of multiple elements that could follow the current input elements. A detailed discussion on this topic can be found in </w:t>
+      </w:r>
+      <w:r>
+        <w:rPr>
+          <w:rFonts w:ascii="Times New Roman" w:eastAsia="Times New Roman" w:hAnsi="Times New Roman" w:cs="Times New Roman"/>
+          <w:sz w:val="18"/>
+          <w:szCs w:val="18"/>
+        </w:rPr>
+        <w:t>(Cui, Surpur, Ahmad, &amp; Hawkins, 2016</w:t>
+      </w:r>
+      <w:r>
+        <w:rPr>
+          <w:rFonts w:ascii="Times New Roman" w:eastAsia="Times New Roman" w:hAnsi="Times New Roman" w:cs="Times New Roman"/>
+          <w:sz w:val="18"/>
+          <w:szCs w:val="18"/>
+        </w:rPr>
+        <w:t xml:space="preserve">, p. </w:t>
+      </w:r>
+      <w:r>
+        <w:rPr>
+          <w:rFonts w:ascii="Times New Roman" w:eastAsia="Times New Roman" w:hAnsi="Times New Roman" w:cs="Times New Roman"/>
+          <w:sz w:val="18"/>
+          <w:szCs w:val="18"/>
+        </w:rPr>
+        <w:t>3</w:t>
+      </w:r>
+      <w:r>
+        <w:rPr>
+          <w:rFonts w:ascii="Times New Roman" w:eastAsia="Times New Roman" w:hAnsi="Times New Roman" w:cs="Times New Roman"/>
+          <w:sz w:val="18"/>
+          <w:szCs w:val="18"/>
+        </w:rPr>
+        <w:t>).</w:t>
+      </w:r>
+    </w:p>
+    <w:p>
+      <w:pPr>
+        <w:pStyle w:val="Heading4"/>
+        <w:spacing w:before="319" w:after="319" w:line="276" w:lineRule="auto"/>
+        <w:jc w:val="both"/>
+        <w:rPr>
+          <w:rFonts w:ascii="Times New Roman" w:eastAsia="Times New Roman" w:hAnsi="Times New Roman" w:cs="Times New Roman"/>
+          <w:b/>
+          <w:bCs/>
+          <w:sz w:val="20"/>
+          <w:szCs w:val="20"/>
+        </w:rPr>
+      </w:pPr>
+      <w:r>
+        <w:rPr>
+          <w:rFonts w:ascii="Times New Roman" w:eastAsia="Times New Roman" w:hAnsi="Times New Roman" w:cs="Times New Roman"/>
+          <w:b/>
+          <w:bCs/>
+          <w:sz w:val="20"/>
+          <w:szCs w:val="20"/>
+        </w:rPr>
         <w:t>3. Classifier Training</w:t>
       </w:r>
     </w:p>
@@ -2920,16 +3343,14 @@
         </w:rPr>
         <w:t xml:space="preserve"> </w:t>
       </w:r>
-      <w:proofErr w:type="spellStart"/>
-      <w:r>
-        <w:rPr>
-          <w:rFonts w:ascii="Times New Roman" w:eastAsia="Times New Roman" w:hAnsi="Times New Roman" w:cs="Times New Roman"/>
-          <w:sz w:val="18"/>
-          <w:szCs w:val="18"/>
-        </w:rPr>
-        <w:t>rom</w:t>
-      </w:r>
-      <w:proofErr w:type="spellEnd"/>
+      <w:r>
+        <w:rPr>
+          <w:rFonts w:ascii="Times New Roman" w:eastAsia="Times New Roman" w:hAnsi="Times New Roman" w:cs="Times New Roman"/>
+          <w:sz w:val="18"/>
+          <w:szCs w:val="18"/>
+        </w:rPr>
+        <w:t>from</w:t>
+      </w:r>
       <w:r>
         <w:rPr>
           <w:rFonts w:ascii="Times New Roman" w:eastAsia="Times New Roman" w:hAnsi="Times New Roman" w:cs="Times New Roman"/>
@@ -3157,27 +3578,7 @@
           <w:sz w:val="18"/>
           <w:szCs w:val="18"/>
         </w:rPr>
-        <w:t>HTM</w:t>
-      </w:r>
-      <w:r>
-        <w:rPr>
-          <w:rFonts w:ascii="Times New Roman" w:eastAsia="Times New Roman" w:hAnsi="Times New Roman" w:cs="Times New Roman"/>
-          <w:b/>
-          <w:bCs/>
-          <w:sz w:val="18"/>
-          <w:szCs w:val="18"/>
-        </w:rPr>
-        <w:t xml:space="preserve"> </w:t>
-      </w:r>
-      <w:r>
-        <w:rPr>
-          <w:rFonts w:ascii="Times New Roman" w:eastAsia="Times New Roman" w:hAnsi="Times New Roman" w:cs="Times New Roman"/>
-          <w:b/>
-          <w:bCs/>
-          <w:sz w:val="18"/>
-          <w:szCs w:val="18"/>
-        </w:rPr>
-        <w:t>Classifier:</w:t>
+        <w:t>HTM Classifier:</w:t>
       </w:r>
       <w:r>
         <w:br/>
@@ -3248,157 +3649,234 @@
             <w:tcW w:w="4425" w:type="dxa"/>
           </w:tcPr>
           <w:p>
-            <w:r>
-              <w:rPr>
-                <w:rFonts w:ascii="Consolas" w:eastAsia="Consolas" w:hAnsi="Consolas" w:cs="Consolas"/>
+            <w:pPr>
+              <w:rPr>
+                <w:rFonts w:asciiTheme="majorBidi" w:hAnsiTheme="majorBidi" w:cstheme="majorBidi"/>
+                <w:sz w:val="20"/>
+                <w:szCs w:val="20"/>
+              </w:rPr>
+            </w:pPr>
+            <w:r>
+              <w:rPr>
+                <w:rFonts w:asciiTheme="majorBidi" w:eastAsia="Consolas" w:hAnsiTheme="majorBidi" w:cstheme="majorBidi"/>
+                <w:sz w:val="20"/>
+                <w:szCs w:val="20"/>
               </w:rPr>
               <w:t xml:space="preserve">// Inside </w:t>
             </w:r>
             <w:proofErr w:type="spellStart"/>
             <w:r>
               <w:rPr>
-                <w:rFonts w:ascii="Consolas" w:eastAsia="Consolas" w:hAnsi="Consolas" w:cs="Consolas"/>
+                <w:rFonts w:asciiTheme="majorBidi" w:eastAsia="Consolas" w:hAnsiTheme="majorBidi" w:cstheme="majorBidi"/>
+                <w:sz w:val="20"/>
+                <w:szCs w:val="20"/>
               </w:rPr>
               <w:t>MyHtmClassifier.Learn</w:t>
             </w:r>
             <w:proofErr w:type="spellEnd"/>
             <w:r>
               <w:rPr>
-                <w:rFonts w:ascii="Consolas" w:eastAsia="Consolas" w:hAnsi="Consolas" w:cs="Consolas"/>
+                <w:rFonts w:asciiTheme="majorBidi" w:eastAsia="Consolas" w:hAnsiTheme="majorBidi" w:cstheme="majorBidi"/>
+                <w:sz w:val="20"/>
+                <w:szCs w:val="20"/>
               </w:rPr>
               <w:t xml:space="preserve">(key, </w:t>
             </w:r>
             <w:proofErr w:type="spellStart"/>
             <w:r>
               <w:rPr>
-                <w:rFonts w:ascii="Consolas" w:eastAsia="Consolas" w:hAnsi="Consolas" w:cs="Consolas"/>
+                <w:rFonts w:asciiTheme="majorBidi" w:eastAsia="Consolas" w:hAnsiTheme="majorBidi" w:cstheme="majorBidi"/>
+                <w:sz w:val="20"/>
+                <w:szCs w:val="20"/>
               </w:rPr>
               <w:t>activeCells</w:t>
             </w:r>
             <w:proofErr w:type="spellEnd"/>
             <w:r>
               <w:rPr>
-                <w:rFonts w:ascii="Consolas" w:eastAsia="Consolas" w:hAnsi="Consolas" w:cs="Consolas"/>
+                <w:rFonts w:asciiTheme="majorBidi" w:eastAsia="Consolas" w:hAnsiTheme="majorBidi" w:cstheme="majorBidi"/>
+                <w:sz w:val="20"/>
+                <w:szCs w:val="20"/>
               </w:rPr>
               <w:t xml:space="preserve">, </w:t>
             </w:r>
             <w:proofErr w:type="spellStart"/>
             <w:r>
               <w:rPr>
-                <w:rFonts w:ascii="Consolas" w:eastAsia="Consolas" w:hAnsi="Consolas" w:cs="Consolas"/>
+                <w:rFonts w:asciiTheme="majorBidi" w:eastAsia="Consolas" w:hAnsiTheme="majorBidi" w:cstheme="majorBidi"/>
+                <w:sz w:val="20"/>
+                <w:szCs w:val="20"/>
               </w:rPr>
               <w:t>originalInput</w:t>
             </w:r>
             <w:proofErr w:type="spellEnd"/>
             <w:r>
               <w:rPr>
-                <w:rFonts w:ascii="Consolas" w:eastAsia="Consolas" w:hAnsi="Consolas" w:cs="Consolas"/>
+                <w:rFonts w:asciiTheme="majorBidi" w:eastAsia="Consolas" w:hAnsiTheme="majorBidi" w:cstheme="majorBidi"/>
+                <w:sz w:val="20"/>
+                <w:szCs w:val="20"/>
               </w:rPr>
               <w:t>)</w:t>
             </w:r>
             <w:r>
+              <w:rPr>
+                <w:rFonts w:asciiTheme="majorBidi" w:hAnsiTheme="majorBidi" w:cstheme="majorBidi"/>
+                <w:sz w:val="20"/>
+                <w:szCs w:val="20"/>
+              </w:rPr>
               <w:br/>
             </w:r>
             <w:proofErr w:type="spellStart"/>
             <w:r>
               <w:rPr>
-                <w:rFonts w:ascii="Consolas" w:eastAsia="Consolas" w:hAnsi="Consolas" w:cs="Consolas"/>
+                <w:rFonts w:asciiTheme="majorBidi" w:eastAsia="Consolas" w:hAnsiTheme="majorBidi" w:cstheme="majorBidi"/>
+                <w:sz w:val="20"/>
+                <w:szCs w:val="20"/>
               </w:rPr>
               <w:t>trainingExamples.Add</w:t>
             </w:r>
             <w:proofErr w:type="spellEnd"/>
             <w:r>
               <w:rPr>
-                <w:rFonts w:ascii="Consolas" w:eastAsia="Consolas" w:hAnsi="Consolas" w:cs="Consolas"/>
+                <w:rFonts w:asciiTheme="majorBidi" w:eastAsia="Consolas" w:hAnsiTheme="majorBidi" w:cstheme="majorBidi"/>
+                <w:sz w:val="20"/>
+                <w:szCs w:val="20"/>
               </w:rPr>
               <w:t xml:space="preserve">(new </w:t>
             </w:r>
             <w:proofErr w:type="spellStart"/>
             <w:r>
               <w:rPr>
-                <w:rFonts w:ascii="Consolas" w:eastAsia="Consolas" w:hAnsi="Consolas" w:cs="Consolas"/>
+                <w:rFonts w:asciiTheme="majorBidi" w:eastAsia="Consolas" w:hAnsiTheme="majorBidi" w:cstheme="majorBidi"/>
+                <w:sz w:val="20"/>
+                <w:szCs w:val="20"/>
               </w:rPr>
               <w:t>TrainingExample</w:t>
             </w:r>
             <w:proofErr w:type="spellEnd"/>
             <w:r>
+              <w:rPr>
+                <w:rFonts w:asciiTheme="majorBidi" w:hAnsiTheme="majorBidi" w:cstheme="majorBidi"/>
+                <w:sz w:val="20"/>
+                <w:szCs w:val="20"/>
+              </w:rPr>
               <w:br/>
             </w:r>
             <w:r>
               <w:rPr>
-                <w:rFonts w:ascii="Consolas" w:eastAsia="Consolas" w:hAnsi="Consolas" w:cs="Consolas"/>
+                <w:rFonts w:asciiTheme="majorBidi" w:eastAsia="Consolas" w:hAnsiTheme="majorBidi" w:cstheme="majorBidi"/>
+                <w:sz w:val="20"/>
+                <w:szCs w:val="20"/>
               </w:rPr>
               <w:t>{</w:t>
             </w:r>
             <w:r>
+              <w:rPr>
+                <w:rFonts w:asciiTheme="majorBidi" w:hAnsiTheme="majorBidi" w:cstheme="majorBidi"/>
+                <w:sz w:val="20"/>
+                <w:szCs w:val="20"/>
+              </w:rPr>
               <w:br/>
             </w:r>
             <w:r>
               <w:rPr>
-                <w:rFonts w:ascii="Consolas" w:eastAsia="Consolas" w:hAnsi="Consolas" w:cs="Consolas"/>
+                <w:rFonts w:asciiTheme="majorBidi" w:eastAsia="Consolas" w:hAnsiTheme="majorBidi" w:cstheme="majorBidi"/>
+                <w:sz w:val="20"/>
+                <w:szCs w:val="20"/>
               </w:rPr>
               <w:t xml:space="preserve">    Key = key,</w:t>
             </w:r>
             <w:r>
+              <w:rPr>
+                <w:rFonts w:asciiTheme="majorBidi" w:hAnsiTheme="majorBidi" w:cstheme="majorBidi"/>
+                <w:sz w:val="20"/>
+                <w:szCs w:val="20"/>
+              </w:rPr>
               <w:br/>
             </w:r>
             <w:r>
               <w:rPr>
-                <w:rFonts w:ascii="Consolas" w:eastAsia="Consolas" w:hAnsi="Consolas" w:cs="Consolas"/>
+                <w:rFonts w:asciiTheme="majorBidi" w:eastAsia="Consolas" w:hAnsiTheme="majorBidi" w:cstheme="majorBidi"/>
+                <w:sz w:val="20"/>
+                <w:szCs w:val="20"/>
               </w:rPr>
               <w:t xml:space="preserve">    SDR = new HashSet&lt;int&gt;(</w:t>
             </w:r>
             <w:proofErr w:type="spellStart"/>
             <w:r>
               <w:rPr>
-                <w:rFonts w:ascii="Consolas" w:eastAsia="Consolas" w:hAnsi="Consolas" w:cs="Consolas"/>
+                <w:rFonts w:asciiTheme="majorBidi" w:eastAsia="Consolas" w:hAnsiTheme="majorBidi" w:cstheme="majorBidi"/>
+                <w:sz w:val="20"/>
+                <w:szCs w:val="20"/>
               </w:rPr>
               <w:t>activeCells</w:t>
             </w:r>
             <w:proofErr w:type="spellEnd"/>
             <w:r>
               <w:rPr>
-                <w:rFonts w:ascii="Consolas" w:eastAsia="Consolas" w:hAnsi="Consolas" w:cs="Consolas"/>
+                <w:rFonts w:asciiTheme="majorBidi" w:eastAsia="Consolas" w:hAnsiTheme="majorBidi" w:cstheme="majorBidi"/>
+                <w:sz w:val="20"/>
+                <w:szCs w:val="20"/>
               </w:rPr>
               <w:t>),</w:t>
             </w:r>
             <w:r>
+              <w:rPr>
+                <w:rFonts w:asciiTheme="majorBidi" w:hAnsiTheme="majorBidi" w:cstheme="majorBidi"/>
+                <w:sz w:val="20"/>
+                <w:szCs w:val="20"/>
+              </w:rPr>
               <w:br/>
             </w:r>
             <w:r>
               <w:rPr>
-                <w:rFonts w:ascii="Consolas" w:eastAsia="Consolas" w:hAnsi="Consolas" w:cs="Consolas"/>
+                <w:rFonts w:asciiTheme="majorBidi" w:eastAsia="Consolas" w:hAnsiTheme="majorBidi" w:cstheme="majorBidi"/>
+                <w:sz w:val="20"/>
+                <w:szCs w:val="20"/>
               </w:rPr>
               <w:t xml:space="preserve">    </w:t>
             </w:r>
             <w:proofErr w:type="spellStart"/>
             <w:r>
               <w:rPr>
-                <w:rFonts w:ascii="Consolas" w:eastAsia="Consolas" w:hAnsi="Consolas" w:cs="Consolas"/>
+                <w:rFonts w:asciiTheme="majorBidi" w:eastAsia="Consolas" w:hAnsiTheme="majorBidi" w:cstheme="majorBidi"/>
+                <w:sz w:val="20"/>
+                <w:szCs w:val="20"/>
               </w:rPr>
               <w:t>OriginalInput</w:t>
             </w:r>
             <w:proofErr w:type="spellEnd"/>
             <w:r>
               <w:rPr>
-                <w:rFonts w:ascii="Consolas" w:eastAsia="Consolas" w:hAnsi="Consolas" w:cs="Consolas"/>
+                <w:rFonts w:asciiTheme="majorBidi" w:eastAsia="Consolas" w:hAnsiTheme="majorBidi" w:cstheme="majorBidi"/>
+                <w:sz w:val="20"/>
+                <w:szCs w:val="20"/>
               </w:rPr>
               <w:t xml:space="preserve"> = </w:t>
             </w:r>
             <w:proofErr w:type="spellStart"/>
             <w:r>
               <w:rPr>
-                <w:rFonts w:ascii="Consolas" w:eastAsia="Consolas" w:hAnsi="Consolas" w:cs="Consolas"/>
+                <w:rFonts w:asciiTheme="majorBidi" w:eastAsia="Consolas" w:hAnsiTheme="majorBidi" w:cstheme="majorBidi"/>
+                <w:sz w:val="20"/>
+                <w:szCs w:val="20"/>
               </w:rPr>
               <w:t>originalInput</w:t>
             </w:r>
             <w:proofErr w:type="spellEnd"/>
             <w:r>
+              <w:rPr>
+                <w:rFonts w:asciiTheme="majorBidi" w:hAnsiTheme="majorBidi" w:cstheme="majorBidi"/>
+                <w:sz w:val="20"/>
+                <w:szCs w:val="20"/>
+              </w:rPr>
               <w:br/>
             </w:r>
             <w:r>
               <w:rPr>
-                <w:rFonts w:ascii="Consolas" w:eastAsia="Consolas" w:hAnsi="Consolas" w:cs="Consolas"/>
+                <w:rFonts w:asciiTheme="majorBidi" w:eastAsia="Consolas" w:hAnsiTheme="majorBidi" w:cstheme="majorBidi"/>
+                <w:sz w:val="20"/>
+                <w:szCs w:val="20"/>
               </w:rPr>
               <w:t>});</w:t>
             </w:r>
@@ -3427,7 +3905,6 @@
           <w:sz w:val="20"/>
           <w:szCs w:val="20"/>
         </w:rPr>
-        <w:lastRenderedPageBreak/>
         <w:t>4. Image Reconstruction and Fusion</w:t>
       </w:r>
     </w:p>
@@ -3484,7 +3961,15 @@
           <w:sz w:val="18"/>
           <w:szCs w:val="18"/>
         </w:rPr>
-        <w:t xml:space="preserve"> The HTM classifier generates a reconstructed image by weighting the original input pixels according to the squared overlap:</w:t>
+        <w:t xml:space="preserve"> The HTM classifier generates a reconstructed </w:t>
+      </w:r>
+      <w:r>
+        <w:rPr>
+          <w:rFonts w:ascii="Times New Roman" w:eastAsia="Times New Roman" w:hAnsi="Times New Roman" w:cs="Times New Roman"/>
+          <w:sz w:val="18"/>
+          <w:szCs w:val="18"/>
+        </w:rPr>
+        <w:t>image by weighting the original input pixels according to the squared overlap:</w:t>
       </w:r>
     </w:p>
     <w:tbl>
@@ -3569,6 +4054,7 @@
               <w:t>(</w:t>
             </w:r>
             <w:proofErr w:type="spellStart"/>
+            <w:proofErr w:type="gramStart"/>
             <w:r>
               <w:rPr>
                 <w:rFonts w:ascii="Times New Roman" w:eastAsia="Times New Roman" w:hAnsi="Times New Roman" w:cs="Times New Roman"/>
@@ -3578,6 +4064,7 @@
               <w:t>scored.Overlap</w:t>
             </w:r>
             <w:proofErr w:type="spellEnd"/>
+            <w:proofErr w:type="gramEnd"/>
             <w:r>
               <w:rPr>
                 <w:rFonts w:ascii="Times New Roman" w:eastAsia="Times New Roman" w:hAnsi="Times New Roman" w:cs="Times New Roman"/>
@@ -3809,13 +4296,23 @@
             <w:r>
               <w:br/>
             </w:r>
-            <w:r>
-              <w:rPr>
-                <w:rFonts w:ascii="Times New Roman" w:eastAsia="Times New Roman" w:hAnsi="Times New Roman" w:cs="Times New Roman"/>
-                <w:sz w:val="20"/>
-                <w:szCs w:val="20"/>
-              </w:rPr>
-              <w:t xml:space="preserve">int[] </w:t>
+            <w:proofErr w:type="gramStart"/>
+            <w:r>
+              <w:rPr>
+                <w:rFonts w:ascii="Times New Roman" w:eastAsia="Times New Roman" w:hAnsi="Times New Roman" w:cs="Times New Roman"/>
+                <w:sz w:val="20"/>
+                <w:szCs w:val="20"/>
+              </w:rPr>
+              <w:t>int[</w:t>
+            </w:r>
+            <w:proofErr w:type="gramEnd"/>
+            <w:r>
+              <w:rPr>
+                <w:rFonts w:ascii="Times New Roman" w:eastAsia="Times New Roman" w:hAnsi="Times New Roman" w:cs="Times New Roman"/>
+                <w:sz w:val="20"/>
+                <w:szCs w:val="20"/>
+              </w:rPr>
+              <w:t xml:space="preserve">] </w:t>
             </w:r>
             <w:proofErr w:type="spellStart"/>
             <w:r>
@@ -3903,7 +4400,29 @@
           <w:sz w:val="18"/>
           <w:szCs w:val="18"/>
         </w:rPr>
-        <w:t>Fusion and Post-Processing:</w:t>
+        <w:t xml:space="preserve">Fusion and </w:t>
+      </w:r>
+      <w:proofErr w:type="gramStart"/>
+      <w:r>
+        <w:rPr>
+          <w:rFonts w:ascii="Times New Roman" w:eastAsia="Times New Roman" w:hAnsi="Times New Roman" w:cs="Times New Roman"/>
+          <w:b/>
+          <w:bCs/>
+          <w:sz w:val="18"/>
+          <w:szCs w:val="18"/>
+        </w:rPr>
+        <w:t>Post-Processing</w:t>
+      </w:r>
+      <w:proofErr w:type="gramEnd"/>
+      <w:r>
+        <w:rPr>
+          <w:rFonts w:ascii="Times New Roman" w:eastAsia="Times New Roman" w:hAnsi="Times New Roman" w:cs="Times New Roman"/>
+          <w:b/>
+          <w:bCs/>
+          <w:sz w:val="18"/>
+          <w:szCs w:val="18"/>
+        </w:rPr>
+        <w:t>:</w:t>
       </w:r>
       <w:r>
         <w:br/>
@@ -4019,6 +4538,7 @@
               <w:t xml:space="preserve"> = </w:t>
             </w:r>
             <w:proofErr w:type="spellStart"/>
+            <w:proofErr w:type="gramStart"/>
             <w:r>
               <w:rPr>
                 <w:rFonts w:ascii="Times New Roman" w:eastAsia="Times New Roman" w:hAnsi="Times New Roman" w:cs="Times New Roman"/>
@@ -4037,6 +4557,7 @@
               <w:t>(</w:t>
             </w:r>
             <w:proofErr w:type="spellStart"/>
+            <w:proofErr w:type="gramEnd"/>
             <w:r>
               <w:rPr>
                 <w:rFonts w:ascii="Times New Roman" w:eastAsia="Times New Roman" w:hAnsi="Times New Roman" w:cs="Times New Roman"/>
@@ -4275,7 +4796,25 @@
                 <w:sz w:val="20"/>
                 <w:szCs w:val="20"/>
               </w:rPr>
-              <w:t>] == 1 ? new Rgba32(255, 255, 255, 255) : new Rgba32(0, 0, 0, 255);</w:t>
+              <w:t xml:space="preserve">] == </w:t>
+            </w:r>
+            <w:proofErr w:type="gramStart"/>
+            <w:r>
+              <w:rPr>
+                <w:rFonts w:ascii="Times New Roman" w:eastAsia="Times New Roman" w:hAnsi="Times New Roman" w:cs="Times New Roman"/>
+                <w:sz w:val="20"/>
+                <w:szCs w:val="20"/>
+              </w:rPr>
+              <w:t>1 ?</w:t>
+            </w:r>
+            <w:proofErr w:type="gramEnd"/>
+            <w:r>
+              <w:rPr>
+                <w:rFonts w:ascii="Times New Roman" w:eastAsia="Times New Roman" w:hAnsi="Times New Roman" w:cs="Times New Roman"/>
+                <w:sz w:val="20"/>
+                <w:szCs w:val="20"/>
+              </w:rPr>
+              <w:t xml:space="preserve"> new Rgba32(255, 255, 255, 255) : new Rgba32(0, 0, 0, 255);</w:t>
             </w:r>
             <w:r>
               <w:br/>
@@ -4344,6 +4883,7 @@
         <w:rPr>
           <w:noProof/>
         </w:rPr>
+        <w:lastRenderedPageBreak/>
         <w:drawing>
           <wp:inline distT="0" distB="0" distL="0" distR="0" wp14:anchorId="73DE698C" wp14:editId="055942EC">
             <wp:extent cx="1314417" cy="1314417"/>
@@ -4360,7 +4900,7 @@
                     <pic:cNvPicPr/>
                   </pic:nvPicPr>
                   <pic:blipFill>
-                    <a:blip r:embed="rId15">
+                    <a:blip r:embed="rId16">
                       <a:extLst>
                         <a:ext uri="{28A0092B-C50C-407E-A947-70E740481C1C}">
                           <a14:useLocalDpi xmlns:a14="http://schemas.microsoft.com/office/drawing/2010/main" val="0"/>
@@ -4415,7 +4955,7 @@
           <w:sz w:val="20"/>
           <w:szCs w:val="20"/>
         </w:rPr>
-        <w:t>3</w:t>
+        <w:t>4</w:t>
       </w:r>
       <w:r>
         <w:rPr>
@@ -4897,6 +5437,7 @@
               <w:br/>
             </w:r>
             <w:proofErr w:type="spellStart"/>
+            <w:proofErr w:type="gramStart"/>
             <w:r>
               <w:rPr>
                 <w:rFonts w:ascii="Times New Roman" w:eastAsia="Times New Roman" w:hAnsi="Times New Roman" w:cs="Times New Roman"/>
@@ -4906,6 +5447,7 @@
               <w:t>worksheet.Cell</w:t>
             </w:r>
             <w:proofErr w:type="spellEnd"/>
+            <w:proofErr w:type="gramEnd"/>
             <w:r>
               <w:rPr>
                 <w:rFonts w:ascii="Times New Roman" w:eastAsia="Times New Roman" w:hAnsi="Times New Roman" w:cs="Times New Roman"/>
@@ -4923,16 +5465,7 @@
                 <w:sz w:val="20"/>
                 <w:szCs w:val="20"/>
               </w:rPr>
-              <w:t xml:space="preserve">// Additional code writes similarity percentages </w:t>
-            </w:r>
-            <w:r>
-              <w:rPr>
-                <w:rFonts w:ascii="Times New Roman" w:eastAsia="Times New Roman" w:hAnsi="Times New Roman" w:cs="Times New Roman"/>
-                <w:sz w:val="20"/>
-                <w:szCs w:val="20"/>
-              </w:rPr>
-              <w:lastRenderedPageBreak/>
-              <w:t>and computes averages.</w:t>
+              <w:t>// Additional code writes similarity percentages and computes averages.</w:t>
             </w:r>
             <w:r>
               <w:br/>
@@ -4995,7 +5528,7 @@
     </w:p>
     <w:p>
       <w:pPr>
-        <w:jc w:val="both"/>
+        <w:jc w:val="center"/>
         <w:rPr>
           <w:rFonts w:ascii="Times New Roman" w:eastAsia="Times New Roman" w:hAnsi="Times New Roman" w:cs="Times New Roman"/>
           <w:b/>
@@ -5033,19 +5566,6 @@
         </w:rPr>
         <w:t xml:space="preserve"> Results</w:t>
       </w:r>
-      <w:r>
-        <w:rPr>
-          <w:rFonts w:ascii="Times New Roman" w:eastAsia="Times New Roman" w:hAnsi="Times New Roman" w:cs="Times New Roman"/>
-          <w:b/>
-          <w:bCs/>
-          <w:i/>
-          <w:iCs/>
-          <w:color w:val="000000" w:themeColor="text1"/>
-          <w:sz w:val="20"/>
-          <w:szCs w:val="20"/>
-        </w:rPr>
-        <w:t xml:space="preserve"> </w:t>
-      </w:r>
     </w:p>
     <w:p>
       <w:pPr>
@@ -5063,7 +5583,15 @@
           <w:sz w:val="18"/>
           <w:szCs w:val="18"/>
         </w:rPr>
-        <w:t>This section presents the evaluation results of the image reconstruction framework. The performance of individual classifiers (KNN and HTM) is compared with the combined approach, which integrates both classifiers for enhanced accuracy.</w:t>
+        <w:t xml:space="preserve">This section presents the evaluation results of the image reconstruction framework. The performance of individual classifiers (KNN and HTM) is summarized in the tables, </w:t>
+      </w:r>
+      <w:r>
+        <w:rPr>
+          <w:rFonts w:ascii="Times New Roman" w:eastAsia="Times New Roman" w:hAnsi="Times New Roman" w:cs="Times New Roman"/>
+          <w:sz w:val="18"/>
+          <w:szCs w:val="18"/>
+        </w:rPr>
+        <w:t>while the fusion classifier (combined HTM + KNN) results are further illustrated through detailed graphs.</w:t>
       </w:r>
     </w:p>
     <w:p>
@@ -5177,460 +5705,6 @@
           <w:szCs w:val="18"/>
         </w:rPr>
         <w:t xml:space="preserve"> Compares pixel-wise accuracy between the reconstructed and original images.</w:t>
-      </w:r>
-    </w:p>
-    <w:p>
-      <w:pPr>
-        <w:spacing w:before="240" w:after="240"/>
-        <w:jc w:val="both"/>
-        <w:rPr>
-          <w:rFonts w:ascii="Times New Roman" w:eastAsia="Times New Roman" w:hAnsi="Times New Roman" w:cs="Times New Roman"/>
-          <w:sz w:val="18"/>
-          <w:szCs w:val="18"/>
-        </w:rPr>
-      </w:pPr>
-      <w:r>
-        <w:rPr>
-          <w:rFonts w:ascii="Times New Roman" w:eastAsia="Times New Roman" w:hAnsi="Times New Roman" w:cs="Times New Roman"/>
-          <w:sz w:val="18"/>
-          <w:szCs w:val="18"/>
-        </w:rPr>
-        <w:t xml:space="preserve">To evaluate the performance of the framework on a specific image, we measured the reconstruction accuracy for </w:t>
-      </w:r>
-      <w:r>
-        <w:rPr>
-          <w:rFonts w:ascii="Times New Roman" w:eastAsia="Times New Roman" w:hAnsi="Times New Roman" w:cs="Times New Roman"/>
-          <w:b/>
-          <w:bCs/>
-          <w:sz w:val="18"/>
-          <w:szCs w:val="18"/>
-        </w:rPr>
-        <w:t>image 0_1450</w:t>
-      </w:r>
-      <w:r>
-        <w:rPr>
-          <w:rFonts w:ascii="Times New Roman" w:eastAsia="Times New Roman" w:hAnsi="Times New Roman" w:cs="Times New Roman"/>
-          <w:sz w:val="18"/>
-          <w:szCs w:val="18"/>
-        </w:rPr>
-        <w:t xml:space="preserve"> using each classifier (KNN, HTM, and Combined</w:t>
-      </w:r>
-      <w:r>
-        <w:rPr>
-          <w:rFonts w:ascii="Times New Roman" w:eastAsia="Times New Roman" w:hAnsi="Times New Roman" w:cs="Times New Roman"/>
-          <w:sz w:val="18"/>
-          <w:szCs w:val="18"/>
-        </w:rPr>
-        <w:t xml:space="preserve"> HTM + KNN</w:t>
-      </w:r>
-      <w:r>
-        <w:rPr>
-          <w:rFonts w:ascii="Times New Roman" w:eastAsia="Times New Roman" w:hAnsi="Times New Roman" w:cs="Times New Roman"/>
-          <w:sz w:val="18"/>
-          <w:szCs w:val="18"/>
-        </w:rPr>
-        <w:t>). The table below summarizes the reconstruction results for this particular image:</w:t>
-      </w:r>
-    </w:p>
-    <w:tbl>
-      <w:tblPr>
-        <w:tblW w:w="0" w:type="auto"/>
-        <w:tblBorders>
-          <w:top w:val="single" w:sz="12" w:space="0" w:color="000000" w:themeColor="text1"/>
-          <w:left w:val="single" w:sz="12" w:space="0" w:color="000000" w:themeColor="text1"/>
-          <w:bottom w:val="single" w:sz="12" w:space="0" w:color="000000" w:themeColor="text1"/>
-          <w:right w:val="single" w:sz="12" w:space="0" w:color="000000" w:themeColor="text1"/>
-          <w:insideH w:val="single" w:sz="12" w:space="0" w:color="000000" w:themeColor="text1"/>
-          <w:insideV w:val="single" w:sz="12" w:space="0" w:color="000000" w:themeColor="text1"/>
-        </w:tblBorders>
-        <w:tblLayout w:type="fixed"/>
-        <w:tblLook w:val="06A0" w:firstRow="1" w:lastRow="0" w:firstColumn="1" w:lastColumn="0" w:noHBand="1" w:noVBand="1"/>
-      </w:tblPr>
-      <w:tblGrid>
-        <w:gridCol w:w="1208"/>
-        <w:gridCol w:w="1553"/>
-        <w:gridCol w:w="1559"/>
-      </w:tblGrid>
-      <w:tr>
-        <w:trPr>
-          <w:trHeight w:val="300"/>
-        </w:trPr>
-        <w:tc>
-          <w:tcPr>
-            <w:tcW w:w="1208" w:type="dxa"/>
-            <w:vAlign w:val="center"/>
-          </w:tcPr>
-          <w:p>
-            <w:pPr>
-              <w:spacing w:after="0"/>
-              <w:jc w:val="both"/>
-              <w:rPr>
-                <w:rFonts w:ascii="Times New Roman" w:eastAsia="Times New Roman" w:hAnsi="Times New Roman" w:cs="Times New Roman"/>
-                <w:b/>
-                <w:bCs/>
-                <w:sz w:val="20"/>
-                <w:szCs w:val="20"/>
-              </w:rPr>
-            </w:pPr>
-            <w:r>
-              <w:rPr>
-                <w:rFonts w:ascii="Times New Roman" w:eastAsia="Times New Roman" w:hAnsi="Times New Roman" w:cs="Times New Roman"/>
-                <w:b/>
-                <w:bCs/>
-                <w:sz w:val="20"/>
-                <w:szCs w:val="20"/>
-              </w:rPr>
-              <w:t>Model</w:t>
-            </w:r>
-          </w:p>
-        </w:tc>
-        <w:tc>
-          <w:tcPr>
-            <w:tcW w:w="1553" w:type="dxa"/>
-            <w:vAlign w:val="center"/>
-          </w:tcPr>
-          <w:p>
-            <w:pPr>
-              <w:spacing w:after="0"/>
-              <w:jc w:val="both"/>
-              <w:rPr>
-                <w:rFonts w:ascii="Times New Roman" w:eastAsia="Times New Roman" w:hAnsi="Times New Roman" w:cs="Times New Roman"/>
-                <w:b/>
-                <w:bCs/>
-                <w:sz w:val="20"/>
-                <w:szCs w:val="20"/>
-              </w:rPr>
-            </w:pPr>
-            <w:r>
-              <w:rPr>
-                <w:rFonts w:ascii="Times New Roman" w:eastAsia="Times New Roman" w:hAnsi="Times New Roman" w:cs="Times New Roman"/>
-                <w:b/>
-                <w:bCs/>
-                <w:sz w:val="20"/>
-                <w:szCs w:val="20"/>
-              </w:rPr>
-              <w:t>Vector Similarity (%)</w:t>
-            </w:r>
-          </w:p>
-        </w:tc>
-        <w:tc>
-          <w:tcPr>
-            <w:tcW w:w="1559" w:type="dxa"/>
-            <w:vAlign w:val="center"/>
-          </w:tcPr>
-          <w:p>
-            <w:pPr>
-              <w:spacing w:after="0"/>
-              <w:jc w:val="both"/>
-              <w:rPr>
-                <w:rFonts w:ascii="Times New Roman" w:eastAsia="Times New Roman" w:hAnsi="Times New Roman" w:cs="Times New Roman"/>
-                <w:b/>
-                <w:bCs/>
-                <w:sz w:val="20"/>
-                <w:szCs w:val="20"/>
-              </w:rPr>
-            </w:pPr>
-            <w:r>
-              <w:rPr>
-                <w:rFonts w:ascii="Times New Roman" w:eastAsia="Times New Roman" w:hAnsi="Times New Roman" w:cs="Times New Roman"/>
-                <w:b/>
-                <w:bCs/>
-                <w:sz w:val="20"/>
-                <w:szCs w:val="20"/>
-              </w:rPr>
-              <w:t>Binary Similarity (%)</w:t>
-            </w:r>
-          </w:p>
-        </w:tc>
-      </w:tr>
-      <w:tr>
-        <w:trPr>
-          <w:trHeight w:val="300"/>
-        </w:trPr>
-        <w:tc>
-          <w:tcPr>
-            <w:tcW w:w="1208" w:type="dxa"/>
-            <w:vAlign w:val="center"/>
-          </w:tcPr>
-          <w:p>
-            <w:pPr>
-              <w:spacing w:after="0"/>
-              <w:jc w:val="both"/>
-              <w:rPr>
-                <w:rFonts w:ascii="Times New Roman" w:eastAsia="Times New Roman" w:hAnsi="Times New Roman" w:cs="Times New Roman"/>
-                <w:b/>
-                <w:bCs/>
-                <w:sz w:val="20"/>
-                <w:szCs w:val="20"/>
-              </w:rPr>
-            </w:pPr>
-            <w:r>
-              <w:rPr>
-                <w:rFonts w:ascii="Times New Roman" w:eastAsia="Times New Roman" w:hAnsi="Times New Roman" w:cs="Times New Roman"/>
-                <w:b/>
-                <w:bCs/>
-                <w:sz w:val="20"/>
-                <w:szCs w:val="20"/>
-              </w:rPr>
-              <w:t>KNN</w:t>
-            </w:r>
-          </w:p>
-        </w:tc>
-        <w:tc>
-          <w:tcPr>
-            <w:tcW w:w="1553" w:type="dxa"/>
-            <w:vAlign w:val="center"/>
-          </w:tcPr>
-          <w:p>
-            <w:pPr>
-              <w:spacing w:after="0"/>
-              <w:jc w:val="both"/>
-              <w:rPr>
-                <w:rFonts w:ascii="Times New Roman" w:eastAsia="Times New Roman" w:hAnsi="Times New Roman" w:cs="Times New Roman"/>
-                <w:sz w:val="20"/>
-                <w:szCs w:val="20"/>
-              </w:rPr>
-            </w:pPr>
-            <w:r>
-              <w:rPr>
-                <w:rFonts w:ascii="Times New Roman" w:eastAsia="Times New Roman" w:hAnsi="Times New Roman" w:cs="Times New Roman"/>
-                <w:sz w:val="20"/>
-                <w:szCs w:val="20"/>
-              </w:rPr>
-              <w:t>87.2</w:t>
-            </w:r>
-          </w:p>
-        </w:tc>
-        <w:tc>
-          <w:tcPr>
-            <w:tcW w:w="1559" w:type="dxa"/>
-            <w:vAlign w:val="center"/>
-          </w:tcPr>
-          <w:p>
-            <w:pPr>
-              <w:spacing w:after="0"/>
-              <w:jc w:val="both"/>
-              <w:rPr>
-                <w:rFonts w:ascii="Times New Roman" w:eastAsia="Times New Roman" w:hAnsi="Times New Roman" w:cs="Times New Roman"/>
-                <w:sz w:val="20"/>
-                <w:szCs w:val="20"/>
-              </w:rPr>
-            </w:pPr>
-            <w:r>
-              <w:rPr>
-                <w:rFonts w:ascii="Times New Roman" w:eastAsia="Times New Roman" w:hAnsi="Times New Roman" w:cs="Times New Roman"/>
-                <w:sz w:val="20"/>
-                <w:szCs w:val="20"/>
-              </w:rPr>
-              <w:t>86.1</w:t>
-            </w:r>
-          </w:p>
-        </w:tc>
-      </w:tr>
-      <w:tr>
-        <w:trPr>
-          <w:trHeight w:val="300"/>
-        </w:trPr>
-        <w:tc>
-          <w:tcPr>
-            <w:tcW w:w="1208" w:type="dxa"/>
-            <w:vAlign w:val="center"/>
-          </w:tcPr>
-          <w:p>
-            <w:pPr>
-              <w:spacing w:after="0"/>
-              <w:jc w:val="both"/>
-              <w:rPr>
-                <w:rFonts w:ascii="Times New Roman" w:eastAsia="Times New Roman" w:hAnsi="Times New Roman" w:cs="Times New Roman"/>
-                <w:b/>
-                <w:bCs/>
-                <w:sz w:val="20"/>
-                <w:szCs w:val="20"/>
-              </w:rPr>
-            </w:pPr>
-            <w:r>
-              <w:rPr>
-                <w:rFonts w:ascii="Times New Roman" w:eastAsia="Times New Roman" w:hAnsi="Times New Roman" w:cs="Times New Roman"/>
-                <w:b/>
-                <w:bCs/>
-                <w:sz w:val="20"/>
-                <w:szCs w:val="20"/>
-              </w:rPr>
-              <w:t>HTM</w:t>
-            </w:r>
-          </w:p>
-        </w:tc>
-        <w:tc>
-          <w:tcPr>
-            <w:tcW w:w="1553" w:type="dxa"/>
-            <w:vAlign w:val="center"/>
-          </w:tcPr>
-          <w:p>
-            <w:pPr>
-              <w:spacing w:after="0"/>
-              <w:jc w:val="both"/>
-              <w:rPr>
-                <w:rFonts w:ascii="Times New Roman" w:eastAsia="Times New Roman" w:hAnsi="Times New Roman" w:cs="Times New Roman"/>
-                <w:sz w:val="20"/>
-                <w:szCs w:val="20"/>
-              </w:rPr>
-            </w:pPr>
-            <w:r>
-              <w:rPr>
-                <w:rFonts w:ascii="Times New Roman" w:eastAsia="Times New Roman" w:hAnsi="Times New Roman" w:cs="Times New Roman"/>
-                <w:sz w:val="20"/>
-                <w:szCs w:val="20"/>
-              </w:rPr>
-              <w:t>95.82</w:t>
-            </w:r>
-          </w:p>
-        </w:tc>
-        <w:tc>
-          <w:tcPr>
-            <w:tcW w:w="1559" w:type="dxa"/>
-            <w:vAlign w:val="center"/>
-          </w:tcPr>
-          <w:p>
-            <w:pPr>
-              <w:spacing w:after="0"/>
-              <w:jc w:val="both"/>
-              <w:rPr>
-                <w:rFonts w:ascii="Times New Roman" w:eastAsia="Times New Roman" w:hAnsi="Times New Roman" w:cs="Times New Roman"/>
-                <w:sz w:val="20"/>
-                <w:szCs w:val="20"/>
-              </w:rPr>
-            </w:pPr>
-            <w:r>
-              <w:rPr>
-                <w:rFonts w:ascii="Times New Roman" w:eastAsia="Times New Roman" w:hAnsi="Times New Roman" w:cs="Times New Roman"/>
-                <w:sz w:val="20"/>
-                <w:szCs w:val="20"/>
-              </w:rPr>
-              <w:t>94.9</w:t>
-            </w:r>
-          </w:p>
-        </w:tc>
-      </w:tr>
-      <w:tr>
-        <w:trPr>
-          <w:trHeight w:val="300"/>
-        </w:trPr>
-        <w:tc>
-          <w:tcPr>
-            <w:tcW w:w="1208" w:type="dxa"/>
-            <w:vAlign w:val="center"/>
-          </w:tcPr>
-          <w:p>
-            <w:pPr>
-              <w:spacing w:after="0"/>
-              <w:jc w:val="both"/>
-              <w:rPr>
-                <w:rFonts w:ascii="Times New Roman" w:eastAsia="Times New Roman" w:hAnsi="Times New Roman" w:cs="Times New Roman"/>
-                <w:b/>
-                <w:bCs/>
-                <w:sz w:val="20"/>
-                <w:szCs w:val="20"/>
-              </w:rPr>
-            </w:pPr>
-            <w:r>
-              <w:rPr>
-                <w:rFonts w:ascii="Times New Roman" w:eastAsia="Times New Roman" w:hAnsi="Times New Roman" w:cs="Times New Roman"/>
-                <w:b/>
-                <w:bCs/>
-                <w:sz w:val="20"/>
-                <w:szCs w:val="20"/>
-              </w:rPr>
-              <w:t>Combined (HTM + KNN)</w:t>
-            </w:r>
-          </w:p>
-        </w:tc>
-        <w:tc>
-          <w:tcPr>
-            <w:tcW w:w="1553" w:type="dxa"/>
-            <w:vAlign w:val="center"/>
-          </w:tcPr>
-          <w:p>
-            <w:pPr>
-              <w:spacing w:after="0"/>
-              <w:jc w:val="both"/>
-              <w:rPr>
-                <w:rFonts w:ascii="Times New Roman" w:eastAsia="Times New Roman" w:hAnsi="Times New Roman" w:cs="Times New Roman"/>
-                <w:sz w:val="20"/>
-                <w:szCs w:val="20"/>
-              </w:rPr>
-            </w:pPr>
-            <w:r>
-              <w:rPr>
-                <w:rFonts w:ascii="Times New Roman" w:eastAsia="Times New Roman" w:hAnsi="Times New Roman" w:cs="Times New Roman"/>
-                <w:sz w:val="20"/>
-                <w:szCs w:val="20"/>
-              </w:rPr>
-              <w:t>95.04</w:t>
-            </w:r>
-          </w:p>
-        </w:tc>
-        <w:tc>
-          <w:tcPr>
-            <w:tcW w:w="1559" w:type="dxa"/>
-            <w:vAlign w:val="center"/>
-          </w:tcPr>
-          <w:p>
-            <w:pPr>
-              <w:spacing w:after="0"/>
-              <w:jc w:val="both"/>
-              <w:rPr>
-                <w:rFonts w:ascii="Times New Roman" w:eastAsia="Times New Roman" w:hAnsi="Times New Roman" w:cs="Times New Roman"/>
-                <w:sz w:val="20"/>
-                <w:szCs w:val="20"/>
-              </w:rPr>
-            </w:pPr>
-            <w:r>
-              <w:rPr>
-                <w:rFonts w:ascii="Times New Roman" w:eastAsia="Times New Roman" w:hAnsi="Times New Roman" w:cs="Times New Roman"/>
-                <w:sz w:val="20"/>
-                <w:szCs w:val="20"/>
-              </w:rPr>
-              <w:t>94.13</w:t>
-            </w:r>
-          </w:p>
-        </w:tc>
-      </w:tr>
-    </w:tbl>
-    <w:p>
-      <w:pPr>
-        <w:spacing w:after="0"/>
-        <w:jc w:val="both"/>
-        <w:rPr>
-          <w:rFonts w:ascii="Times New Roman" w:eastAsia="Times New Roman" w:hAnsi="Times New Roman" w:cs="Times New Roman"/>
-          <w:sz w:val="20"/>
-          <w:szCs w:val="20"/>
-        </w:rPr>
-      </w:pPr>
-      <w:r>
-        <w:rPr>
-          <w:rFonts w:ascii="Times New Roman" w:eastAsia="Times New Roman" w:hAnsi="Times New Roman" w:cs="Times New Roman"/>
-          <w:sz w:val="20"/>
-          <w:szCs w:val="20"/>
-        </w:rPr>
-        <w:t xml:space="preserve">Tables 2: Demonstrates similarity results for </w:t>
-      </w:r>
-      <w:r>
-        <w:rPr>
-          <w:rFonts w:ascii="Times New Roman" w:eastAsia="Times New Roman" w:hAnsi="Times New Roman" w:cs="Times New Roman"/>
-          <w:b/>
-          <w:bCs/>
-          <w:sz w:val="20"/>
-          <w:szCs w:val="20"/>
-        </w:rPr>
-        <w:t>image 0_1450</w:t>
-      </w:r>
-      <w:r>
-        <w:rPr>
-          <w:rFonts w:ascii="Times New Roman" w:eastAsia="Times New Roman" w:hAnsi="Times New Roman" w:cs="Times New Roman"/>
-          <w:sz w:val="20"/>
-          <w:szCs w:val="20"/>
-        </w:rPr>
-        <w:t xml:space="preserve"> </w:t>
       </w:r>
     </w:p>
     <w:p>
@@ -6047,42 +6121,44 @@
         <w:jc w:val="both"/>
         <w:rPr>
           <w:rFonts w:ascii="Times New Roman" w:eastAsia="Times New Roman" w:hAnsi="Times New Roman" w:cs="Times New Roman"/>
-          <w:sz w:val="20"/>
-          <w:szCs w:val="20"/>
-        </w:rPr>
-      </w:pPr>
-      <w:r>
-        <w:rPr>
-          <w:rFonts w:ascii="Times New Roman" w:eastAsia="Times New Roman" w:hAnsi="Times New Roman" w:cs="Times New Roman"/>
-          <w:sz w:val="20"/>
-          <w:szCs w:val="20"/>
-        </w:rPr>
-        <w:t xml:space="preserve">Tables </w:t>
-      </w:r>
-      <w:r>
-        <w:rPr>
-          <w:rFonts w:ascii="Times New Roman" w:eastAsia="Times New Roman" w:hAnsi="Times New Roman" w:cs="Times New Roman"/>
-          <w:sz w:val="20"/>
-          <w:szCs w:val="20"/>
-        </w:rPr>
-        <w:t>3</w:t>
-      </w:r>
-      <w:r>
-        <w:rPr>
-          <w:rFonts w:ascii="Times New Roman" w:eastAsia="Times New Roman" w:hAnsi="Times New Roman" w:cs="Times New Roman"/>
-          <w:sz w:val="20"/>
-          <w:szCs w:val="20"/>
-        </w:rPr>
-        <w:t xml:space="preserve">: Demonstrates similarity results for </w:t>
-      </w:r>
-      <w:r>
-        <w:rPr>
-          <w:rFonts w:ascii="Times New Roman" w:eastAsia="Times New Roman" w:hAnsi="Times New Roman" w:cs="Times New Roman"/>
           <w:b/>
           <w:bCs/>
           <w:sz w:val="20"/>
           <w:szCs w:val="20"/>
         </w:rPr>
+      </w:pPr>
+      <w:r>
+        <w:rPr>
+          <w:rFonts w:ascii="Times New Roman" w:eastAsia="Times New Roman" w:hAnsi="Times New Roman" w:cs="Times New Roman"/>
+          <w:sz w:val="20"/>
+          <w:szCs w:val="20"/>
+        </w:rPr>
+        <w:t xml:space="preserve">Tables </w:t>
+      </w:r>
+      <w:r>
+        <w:rPr>
+          <w:rFonts w:ascii="Times New Roman" w:eastAsia="Times New Roman" w:hAnsi="Times New Roman" w:cs="Times New Roman"/>
+          <w:sz w:val="20"/>
+          <w:szCs w:val="20"/>
+        </w:rPr>
+        <w:t>2</w:t>
+      </w:r>
+      <w:r>
+        <w:rPr>
+          <w:rFonts w:ascii="Times New Roman" w:eastAsia="Times New Roman" w:hAnsi="Times New Roman" w:cs="Times New Roman"/>
+          <w:sz w:val="20"/>
+          <w:szCs w:val="20"/>
+        </w:rPr>
+        <w:t xml:space="preserve">: Demonstrates similarity results for </w:t>
+      </w:r>
+      <w:r>
+        <w:rPr>
+          <w:rFonts w:ascii="Times New Roman" w:eastAsia="Times New Roman" w:hAnsi="Times New Roman" w:cs="Times New Roman"/>
+          <w:b/>
+          <w:bCs/>
+          <w:sz w:val="20"/>
+          <w:szCs w:val="20"/>
+        </w:rPr>
         <w:t>the entire test set</w:t>
       </w:r>
     </w:p>
@@ -6090,13 +6166,6 @@
       <w:pPr>
         <w:spacing w:before="240" w:after="240"/>
         <w:jc w:val="both"/>
-        <w:rPr>
-          <w:rFonts w:ascii="Times New Roman" w:eastAsia="Times New Roman" w:hAnsi="Times New Roman" w:cs="Times New Roman"/>
-          <w:sz w:val="20"/>
-          <w:szCs w:val="20"/>
-        </w:rPr>
-      </w:pPr>
-      <w:r>
         <w:rPr>
           <w:rFonts w:ascii="Times New Roman" w:eastAsia="Times New Roman" w:hAnsi="Times New Roman" w:cs="Times New Roman"/>
           <w:b/>
@@ -6107,7 +6176,426 @@
           <w:sz w:val="20"/>
           <w:szCs w:val="20"/>
         </w:rPr>
-        <w:t xml:space="preserve">2. Model Comparison </w:t>
+      </w:pPr>
+      <w:r>
+        <w:rPr>
+          <w:rFonts w:ascii="Times New Roman" w:eastAsia="Times New Roman" w:hAnsi="Times New Roman" w:cs="Times New Roman"/>
+          <w:b/>
+          <w:bCs/>
+          <w:i/>
+          <w:iCs/>
+          <w:color w:val="0F4761" w:themeColor="accent1" w:themeShade="BF"/>
+          <w:sz w:val="20"/>
+          <w:szCs w:val="20"/>
+        </w:rPr>
+        <w:t>2. Fusion Classifier Performance</w:t>
+      </w:r>
+    </w:p>
+    <w:p>
+      <w:pPr>
+        <w:spacing w:after="0"/>
+        <w:jc w:val="both"/>
+        <w:rPr>
+          <w:rFonts w:ascii="Times New Roman" w:eastAsia="Times New Roman" w:hAnsi="Times New Roman" w:cs="Times New Roman"/>
+          <w:sz w:val="18"/>
+          <w:szCs w:val="18"/>
+        </w:rPr>
+      </w:pPr>
+      <w:r>
+        <w:rPr>
+          <w:rFonts w:ascii="Times New Roman" w:eastAsia="Times New Roman" w:hAnsi="Times New Roman" w:cs="Times New Roman"/>
+          <w:sz w:val="18"/>
+          <w:szCs w:val="18"/>
+        </w:rPr>
+        <w:t>To further illustrate the performance of the fusion (combined) classifier, two graphs are provided. These graphs demonstrate the distribution and variation of similarity scores achieved by the fusion classifier across all test images.</w:t>
+      </w:r>
+    </w:p>
+    <w:p>
+      <w:pPr>
+        <w:spacing w:after="0"/>
+        <w:jc w:val="both"/>
+        <w:rPr>
+          <w:rFonts w:ascii="Times New Roman" w:eastAsia="Times New Roman" w:hAnsi="Times New Roman" w:cs="Times New Roman"/>
+          <w:b/>
+          <w:bCs/>
+          <w:sz w:val="18"/>
+          <w:szCs w:val="18"/>
+        </w:rPr>
+      </w:pPr>
+    </w:p>
+    <w:p>
+      <w:pPr>
+        <w:spacing w:after="0"/>
+        <w:jc w:val="both"/>
+        <w:rPr>
+          <w:rFonts w:ascii="Times New Roman" w:eastAsia="Times New Roman" w:hAnsi="Times New Roman" w:cs="Times New Roman"/>
+          <w:b/>
+          <w:bCs/>
+          <w:sz w:val="18"/>
+          <w:szCs w:val="18"/>
+        </w:rPr>
+      </w:pPr>
+      <w:r>
+        <w:rPr>
+          <w:rFonts w:ascii="Times New Roman" w:eastAsia="Times New Roman" w:hAnsi="Times New Roman" w:cs="Times New Roman"/>
+          <w:b/>
+          <w:bCs/>
+          <w:noProof/>
+          <w:sz w:val="18"/>
+          <w:szCs w:val="18"/>
+        </w:rPr>
+        <w:lastRenderedPageBreak/>
+        <w:drawing>
+          <wp:inline distT="0" distB="0" distL="0" distR="0" wp14:anchorId="2A7B18FE" wp14:editId="4EF88729">
+            <wp:extent cx="2752725" cy="1722365"/>
+            <wp:effectExtent l="0" t="0" r="0" b="0"/>
+            <wp:docPr id="338634971" name="Picture 1"/>
+            <wp:cNvGraphicFramePr>
+              <a:graphicFrameLocks xmlns:a="http://schemas.openxmlformats.org/drawingml/2006/main" noChangeAspect="1"/>
+            </wp:cNvGraphicFramePr>
+            <a:graphic xmlns:a="http://schemas.openxmlformats.org/drawingml/2006/main">
+              <a:graphicData uri="http://schemas.openxmlformats.org/drawingml/2006/picture">
+                <pic:pic xmlns:pic="http://schemas.openxmlformats.org/drawingml/2006/picture">
+                  <pic:nvPicPr>
+                    <pic:cNvPr id="338634971" name="Picture 338634971"/>
+                    <pic:cNvPicPr/>
+                  </pic:nvPicPr>
+                  <pic:blipFill>
+                    <a:blip r:embed="rId17">
+                      <a:extLst>
+                        <a:ext uri="{28A0092B-C50C-407E-A947-70E740481C1C}">
+                          <a14:useLocalDpi xmlns:a14="http://schemas.microsoft.com/office/drawing/2010/main" val="0"/>
+                        </a:ext>
+                      </a:extLst>
+                    </a:blip>
+                    <a:stretch>
+                      <a:fillRect/>
+                    </a:stretch>
+                  </pic:blipFill>
+                  <pic:spPr>
+                    <a:xfrm>
+                      <a:off x="0" y="0"/>
+                      <a:ext cx="2768008" cy="1731927"/>
+                    </a:xfrm>
+                    <a:prstGeom prst="rect">
+                      <a:avLst/>
+                    </a:prstGeom>
+                  </pic:spPr>
+                </pic:pic>
+              </a:graphicData>
+            </a:graphic>
+          </wp:inline>
+        </w:drawing>
+      </w:r>
+    </w:p>
+    <w:p>
+      <w:pPr>
+        <w:spacing w:after="0"/>
+        <w:jc w:val="both"/>
+        <w:rPr>
+          <w:rFonts w:ascii="Times New Roman" w:eastAsia="Times New Roman" w:hAnsi="Times New Roman" w:cs="Times New Roman"/>
+          <w:b/>
+          <w:bCs/>
+          <w:sz w:val="18"/>
+          <w:szCs w:val="18"/>
+        </w:rPr>
+      </w:pPr>
+    </w:p>
+    <w:p>
+      <w:pPr>
+        <w:spacing w:after="0"/>
+        <w:jc w:val="both"/>
+        <w:rPr>
+          <w:rFonts w:ascii="Times New Roman" w:eastAsia="Times New Roman" w:hAnsi="Times New Roman" w:cs="Times New Roman"/>
+          <w:sz w:val="20"/>
+          <w:szCs w:val="20"/>
+        </w:rPr>
+      </w:pPr>
+      <w:r>
+        <w:rPr>
+          <w:rFonts w:ascii="Times New Roman" w:eastAsia="Times New Roman" w:hAnsi="Times New Roman" w:cs="Times New Roman"/>
+          <w:sz w:val="20"/>
+          <w:szCs w:val="20"/>
+        </w:rPr>
+        <w:t xml:space="preserve">Figure </w:t>
+      </w:r>
+      <w:r>
+        <w:rPr>
+          <w:rFonts w:ascii="Times New Roman" w:eastAsia="Times New Roman" w:hAnsi="Times New Roman" w:cs="Times New Roman"/>
+          <w:sz w:val="20"/>
+          <w:szCs w:val="20"/>
+        </w:rPr>
+        <w:t>5</w:t>
+      </w:r>
+      <w:r>
+        <w:rPr>
+          <w:rFonts w:ascii="Times New Roman" w:eastAsia="Times New Roman" w:hAnsi="Times New Roman" w:cs="Times New Roman"/>
+          <w:sz w:val="20"/>
+          <w:szCs w:val="20"/>
+        </w:rPr>
+        <w:t>: Box Plot of Similarity Scores (Fusion Classifier)</w:t>
+      </w:r>
+    </w:p>
+    <w:p>
+      <w:pPr>
+        <w:spacing w:after="0"/>
+        <w:jc w:val="both"/>
+        <w:rPr>
+          <w:rFonts w:ascii="Times New Roman" w:eastAsia="Times New Roman" w:hAnsi="Times New Roman" w:cs="Times New Roman"/>
+          <w:sz w:val="18"/>
+          <w:szCs w:val="18"/>
+        </w:rPr>
+      </w:pPr>
+      <w:r>
+        <w:rPr>
+          <w:rFonts w:ascii="Times New Roman" w:eastAsia="Times New Roman" w:hAnsi="Times New Roman" w:cs="Times New Roman"/>
+          <w:sz w:val="18"/>
+          <w:szCs w:val="18"/>
+        </w:rPr>
+        <w:br/>
+        <w:t>This box plot visualizes the distribution of similarity scores for the fusion classifier. The graph shows a median vector similarity score of approximately 90% (with the 25th percentile at 87% and the 75th percentile at 94%) and a median binary similarity score of around 88% (with quartile boundaries of 85% and 91%). Minimal outliers indicate that the fusion approach consistently achieves high reconstruction accuracy across the test set.</w:t>
+      </w:r>
+    </w:p>
+    <w:p>
+      <w:pPr>
+        <w:spacing w:after="0"/>
+        <w:jc w:val="both"/>
+        <w:rPr>
+          <w:rFonts w:ascii="Times New Roman" w:eastAsia="Times New Roman" w:hAnsi="Times New Roman" w:cs="Times New Roman"/>
+          <w:sz w:val="18"/>
+          <w:szCs w:val="18"/>
+        </w:rPr>
+      </w:pPr>
+    </w:p>
+    <w:p>
+      <w:pPr>
+        <w:spacing w:after="0"/>
+        <w:jc w:val="both"/>
+        <w:rPr>
+          <w:rFonts w:ascii="Times New Roman" w:eastAsia="Times New Roman" w:hAnsi="Times New Roman" w:cs="Times New Roman"/>
+          <w:sz w:val="18"/>
+          <w:szCs w:val="18"/>
+        </w:rPr>
+      </w:pPr>
+    </w:p>
+    <w:p>
+      <w:pPr>
+        <w:spacing w:after="0"/>
+        <w:jc w:val="both"/>
+        <w:rPr>
+          <w:rFonts w:ascii="Times New Roman" w:eastAsia="Times New Roman" w:hAnsi="Times New Roman" w:cs="Times New Roman"/>
+          <w:sz w:val="18"/>
+          <w:szCs w:val="18"/>
+        </w:rPr>
+      </w:pPr>
+    </w:p>
+    <w:p>
+      <w:pPr>
+        <w:spacing w:after="0"/>
+        <w:jc w:val="both"/>
+        <w:rPr>
+          <w:rFonts w:ascii="Times New Roman" w:eastAsia="Times New Roman" w:hAnsi="Times New Roman" w:cs="Times New Roman"/>
+          <w:sz w:val="18"/>
+          <w:szCs w:val="18"/>
+        </w:rPr>
+      </w:pPr>
+    </w:p>
+    <w:p>
+      <w:pPr>
+        <w:spacing w:after="0"/>
+        <w:jc w:val="both"/>
+        <w:rPr>
+          <w:rFonts w:ascii="Times New Roman" w:eastAsia="Times New Roman" w:hAnsi="Times New Roman" w:cs="Times New Roman"/>
+          <w:sz w:val="18"/>
+          <w:szCs w:val="18"/>
+        </w:rPr>
+      </w:pPr>
+      <w:r>
+        <w:rPr>
+          <w:rFonts w:ascii="Times New Roman" w:eastAsia="Times New Roman" w:hAnsi="Times New Roman" w:cs="Times New Roman"/>
+          <w:noProof/>
+          <w:sz w:val="18"/>
+          <w:szCs w:val="18"/>
+        </w:rPr>
+        <w:drawing>
+          <wp:inline distT="0" distB="0" distL="0" distR="0" wp14:anchorId="52ECD505" wp14:editId="52C36A3D">
+            <wp:extent cx="2783039" cy="1552575"/>
+            <wp:effectExtent l="0" t="0" r="0" b="0"/>
+            <wp:docPr id="2088680804" name="Picture 2"/>
+            <wp:cNvGraphicFramePr>
+              <a:graphicFrameLocks xmlns:a="http://schemas.openxmlformats.org/drawingml/2006/main" noChangeAspect="1"/>
+            </wp:cNvGraphicFramePr>
+            <a:graphic xmlns:a="http://schemas.openxmlformats.org/drawingml/2006/main">
+              <a:graphicData uri="http://schemas.openxmlformats.org/drawingml/2006/picture">
+                <pic:pic xmlns:pic="http://schemas.openxmlformats.org/drawingml/2006/picture">
+                  <pic:nvPicPr>
+                    <pic:cNvPr id="2088680804" name="Picture 2088680804"/>
+                    <pic:cNvPicPr/>
+                  </pic:nvPicPr>
+                  <pic:blipFill>
+                    <a:blip r:embed="rId18" cstate="print">
+                      <a:extLst>
+                        <a:ext uri="{28A0092B-C50C-407E-A947-70E740481C1C}">
+                          <a14:useLocalDpi xmlns:a14="http://schemas.microsoft.com/office/drawing/2010/main" val="0"/>
+                        </a:ext>
+                      </a:extLst>
+                    </a:blip>
+                    <a:stretch>
+                      <a:fillRect/>
+                    </a:stretch>
+                  </pic:blipFill>
+                  <pic:spPr>
+                    <a:xfrm>
+                      <a:off x="0" y="0"/>
+                      <a:ext cx="2790910" cy="1556966"/>
+                    </a:xfrm>
+                    <a:prstGeom prst="rect">
+                      <a:avLst/>
+                    </a:prstGeom>
+                  </pic:spPr>
+                </pic:pic>
+              </a:graphicData>
+            </a:graphic>
+          </wp:inline>
+        </w:drawing>
+      </w:r>
+    </w:p>
+    <w:p>
+      <w:pPr>
+        <w:spacing w:after="0"/>
+        <w:jc w:val="both"/>
+        <w:rPr>
+          <w:rFonts w:ascii="Times New Roman" w:eastAsia="Times New Roman" w:hAnsi="Times New Roman" w:cs="Times New Roman"/>
+          <w:sz w:val="20"/>
+          <w:szCs w:val="20"/>
+        </w:rPr>
+      </w:pPr>
+    </w:p>
+    <w:p>
+      <w:pPr>
+        <w:spacing w:after="0"/>
+        <w:jc w:val="both"/>
+        <w:rPr>
+          <w:rFonts w:ascii="Times New Roman" w:eastAsia="Times New Roman" w:hAnsi="Times New Roman" w:cs="Times New Roman"/>
+          <w:sz w:val="20"/>
+          <w:szCs w:val="20"/>
+        </w:rPr>
+      </w:pPr>
+      <w:r>
+        <w:rPr>
+          <w:rFonts w:ascii="Times New Roman" w:eastAsia="Times New Roman" w:hAnsi="Times New Roman" w:cs="Times New Roman"/>
+          <w:sz w:val="20"/>
+          <w:szCs w:val="20"/>
+        </w:rPr>
+        <w:t xml:space="preserve">Figure </w:t>
+      </w:r>
+      <w:r>
+        <w:rPr>
+          <w:rFonts w:ascii="Times New Roman" w:eastAsia="Times New Roman" w:hAnsi="Times New Roman" w:cs="Times New Roman"/>
+          <w:sz w:val="20"/>
+          <w:szCs w:val="20"/>
+        </w:rPr>
+        <w:t>6</w:t>
+      </w:r>
+      <w:r>
+        <w:rPr>
+          <w:rFonts w:ascii="Times New Roman" w:eastAsia="Times New Roman" w:hAnsi="Times New Roman" w:cs="Times New Roman"/>
+          <w:sz w:val="20"/>
+          <w:szCs w:val="20"/>
+        </w:rPr>
+        <w:t>: Histogram of Similarity Scores (Fusion Classifier)</w:t>
+      </w:r>
+    </w:p>
+    <w:p>
+      <w:pPr>
+        <w:spacing w:after="0"/>
+        <w:jc w:val="both"/>
+        <w:rPr>
+          <w:rFonts w:ascii="Times New Roman" w:eastAsia="Times New Roman" w:hAnsi="Times New Roman" w:cs="Times New Roman"/>
+          <w:sz w:val="18"/>
+          <w:szCs w:val="18"/>
+        </w:rPr>
+      </w:pPr>
+      <w:r>
+        <w:rPr>
+          <w:rFonts w:ascii="Times New Roman" w:eastAsia="Times New Roman" w:hAnsi="Times New Roman" w:cs="Times New Roman"/>
+          <w:sz w:val="18"/>
+          <w:szCs w:val="18"/>
+        </w:rPr>
+        <w:br/>
+        <w:t xml:space="preserve">This histogram illustrates the frequency distribution of similarity scores for the combined classifier. The majority of reconstructed images exhibit high similarity, with most scores falling within the 80%–100% range, </w:t>
+      </w:r>
+      <w:r>
+        <w:rPr>
+          <w:rFonts w:ascii="Times New Roman" w:eastAsia="Times New Roman" w:hAnsi="Times New Roman" w:cs="Times New Roman"/>
+          <w:sz w:val="18"/>
+          <w:szCs w:val="18"/>
+        </w:rPr>
+        <w:t>with a prominent peak in the 85%–90% range.</w:t>
+      </w:r>
+      <w:r>
+        <w:rPr>
+          <w:rFonts w:ascii="Times New Roman" w:eastAsia="Times New Roman" w:hAnsi="Times New Roman" w:cs="Times New Roman"/>
+          <w:sz w:val="18"/>
+          <w:szCs w:val="18"/>
+        </w:rPr>
+        <w:t xml:space="preserve"> </w:t>
+      </w:r>
+      <w:r>
+        <w:rPr>
+          <w:rFonts w:ascii="Times New Roman" w:eastAsia="Times New Roman" w:hAnsi="Times New Roman" w:cs="Times New Roman"/>
+          <w:sz w:val="18"/>
+          <w:szCs w:val="18"/>
+        </w:rPr>
+        <w:t>indicating that the fusion classifier consistently produces high-quality reconstructions across the test set.</w:t>
+      </w:r>
+    </w:p>
+    <w:p>
+      <w:pPr>
+        <w:spacing w:after="0"/>
+        <w:jc w:val="both"/>
+        <w:rPr>
+          <w:rFonts w:ascii="Times New Roman" w:eastAsia="Times New Roman" w:hAnsi="Times New Roman" w:cs="Times New Roman"/>
+          <w:sz w:val="18"/>
+          <w:szCs w:val="18"/>
+        </w:rPr>
+      </w:pPr>
+    </w:p>
+    <w:p>
+      <w:pPr>
+        <w:spacing w:after="0"/>
+        <w:jc w:val="both"/>
+        <w:rPr>
+          <w:rFonts w:ascii="Times New Roman" w:eastAsia="Times New Roman" w:hAnsi="Times New Roman" w:cs="Times New Roman"/>
+          <w:sz w:val="20"/>
+          <w:szCs w:val="20"/>
+        </w:rPr>
+      </w:pPr>
+      <w:r>
+        <w:rPr>
+          <w:rFonts w:ascii="Times New Roman" w:eastAsia="Times New Roman" w:hAnsi="Times New Roman" w:cs="Times New Roman"/>
+          <w:b/>
+          <w:bCs/>
+          <w:i/>
+          <w:iCs/>
+          <w:color w:val="0F4761" w:themeColor="accent1" w:themeShade="BF"/>
+          <w:sz w:val="20"/>
+          <w:szCs w:val="20"/>
+        </w:rPr>
+        <w:t>3</w:t>
+      </w:r>
+      <w:r>
+        <w:rPr>
+          <w:rFonts w:ascii="Times New Roman" w:eastAsia="Times New Roman" w:hAnsi="Times New Roman" w:cs="Times New Roman"/>
+          <w:b/>
+          <w:bCs/>
+          <w:i/>
+          <w:iCs/>
+          <w:color w:val="0F4761" w:themeColor="accent1" w:themeShade="BF"/>
+          <w:sz w:val="20"/>
+          <w:szCs w:val="20"/>
+        </w:rPr>
+        <w:t xml:space="preserve">. Model Comparison </w:t>
       </w:r>
       <w:r>
         <w:rPr>
@@ -6157,7 +6645,15 @@
           <w:sz w:val="18"/>
           <w:szCs w:val="18"/>
         </w:rPr>
-        <w:t xml:space="preserve">achieved the highest accuracy, outperforming both individual classifiers. It recorded an average </w:t>
+        <w:t xml:space="preserve">achieved the highest accuracy, outperforming both </w:t>
+      </w:r>
+      <w:r>
+        <w:rPr>
+          <w:rFonts w:ascii="Times New Roman" w:eastAsia="Times New Roman" w:hAnsi="Times New Roman" w:cs="Times New Roman"/>
+          <w:sz w:val="18"/>
+          <w:szCs w:val="18"/>
+        </w:rPr>
+        <w:t xml:space="preserve">individual classifiers. It recorded an average </w:t>
       </w:r>
       <w:r>
         <w:rPr>
@@ -6407,7 +6903,6 @@
           <w:sz w:val="18"/>
           <w:szCs w:val="18"/>
         </w:rPr>
-        <w:lastRenderedPageBreak/>
         <w:t xml:space="preserve">The fusion of the KNN and HTM classifiers resulted in the highest reconstruction accuracy. The combined model achieved an average vector similarity of 86.22% and a binary similarity of 88.12%. </w:t>
       </w:r>
     </w:p>
@@ -6446,11 +6941,21 @@
           <w:sz w:val="18"/>
           <w:szCs w:val="18"/>
         </w:rPr>
-        <w:t>These findings confirm that the hybrid framework not only improves the overall accuracy but also enhances the robustness of the reconstruction process. In the future, additional optimizations to the fusion method, as well as testing with larger and more diverse datasets, could further improve the system’s ability to reconstruct complex image data. Additionally, incorporating other classifiers or fine-tuning the parameters of the existing models could further enhance performance, making the approach even more adaptable to various image reconstruction tasks.</w:t>
-      </w:r>
-    </w:p>
-    <w:p>
-      <w:pPr>
+        <w:t xml:space="preserve">These findings confirm that the hybrid framework not only improves the overall accuracy but also enhances the robustness of the reconstruction process. In the future, additional optimizations to the fusion method, as well as testing with larger and more diverse datasets, could further improve the system’s ability to reconstruct complex image </w:t>
+      </w:r>
+      <w:r>
+        <w:rPr>
+          <w:rFonts w:ascii="Times New Roman" w:eastAsia="Times New Roman" w:hAnsi="Times New Roman" w:cs="Times New Roman"/>
+          <w:sz w:val="18"/>
+          <w:szCs w:val="18"/>
+        </w:rPr>
+        <w:lastRenderedPageBreak/>
+        <w:t>data. Additionally, incorporating other classifiers or fine-tuning the parameters of the existing models could further enhance performance, making the approach even more adaptable to various image reconstruction tasks.</w:t>
+      </w:r>
+    </w:p>
+    <w:p>
+      <w:pPr>
+        <w:jc w:val="center"/>
         <w:rPr>
           <w:rFonts w:ascii="Times New Roman" w:eastAsia="Times New Roman" w:hAnsi="Times New Roman" w:cs="Times New Roman"/>
           <w:b/>
@@ -6473,35 +6978,6 @@
           <w:sz w:val="20"/>
           <w:szCs w:val="20"/>
         </w:rPr>
-        <w:br w:type="page"/>
-      </w:r>
-    </w:p>
-    <w:p>
-      <w:pPr>
-        <w:jc w:val="center"/>
-        <w:rPr>
-          <w:rFonts w:ascii="Times New Roman" w:eastAsia="Times New Roman" w:hAnsi="Times New Roman" w:cs="Times New Roman"/>
-          <w:b/>
-          <w:bCs/>
-          <w:i/>
-          <w:iCs/>
-          <w:color w:val="000000" w:themeColor="text1"/>
-          <w:sz w:val="20"/>
-          <w:szCs w:val="20"/>
-        </w:rPr>
-      </w:pPr>
-      <w:r>
-        <w:rPr>
-          <w:rFonts w:ascii="Times New Roman" w:eastAsia="Times New Roman" w:hAnsi="Times New Roman" w:cs="Times New Roman"/>
-          <w:b/>
-          <w:bCs/>
-          <w:i/>
-          <w:iCs/>
-          <w:color w:val="000000" w:themeColor="text1"/>
-          <w:sz w:val="20"/>
-          <w:szCs w:val="20"/>
-        </w:rPr>
-        <w:lastRenderedPageBreak/>
         <w:t xml:space="preserve">V. </w:t>
       </w:r>
       <w:r>
@@ -7123,7 +7599,7 @@
               <wp:inline distT="0" distB="0" distL="0" distR="0" wp14:anchorId="1ADA3B58" wp14:editId="41236687">
                 <wp:extent cx="1219200" cy="628650"/>
                 <wp:effectExtent l="0" t="0" r="0" b="0"/>
-                <wp:docPr id="1" name="Grafik 4"/>
+                <wp:docPr id="1238970822" name="Grafik 4"/>
                 <wp:cNvGraphicFramePr>
                   <a:graphicFrameLocks xmlns:a="http://schemas.openxmlformats.org/drawingml/2006/main" noChangeAspect="1"/>
                 </wp:cNvGraphicFramePr>
@@ -9420,7 +9896,7 @@
   <w:style w:type="paragraph" w:default="1" w:styleId="Normal">
     <w:name w:val="Normal"/>
     <w:qFormat/>
-    <w:rsid w:val="00C30FA0"/>
+    <w:rsid w:val="00901202"/>
   </w:style>
   <w:style w:type="paragraph" w:styleId="Heading1">
     <w:name w:val="heading 1"/>

</xml_diff>

<commit_message>
following feedback I received i fixed the research paper
</commit_message>
<xml_diff>
--- a/Image_Reconstruction_Classifier/Documentation/ML 24-25-01 Investigate Image Reconstruction By using Classifier.docx
+++ b/Image_Reconstruction_Classifier/Documentation/ML 24-25-01 Investigate Image Reconstruction By using Classifier.docx
@@ -479,7 +479,41 @@
           <w:sz w:val="18"/>
           <w:szCs w:val="18"/>
         </w:rPr>
-        <w:t>.” The</w:t>
+        <w:t xml:space="preserve">.” </w:t>
+      </w:r>
+      <w:r>
+        <w:rPr>
+          <w:rFonts w:ascii="Times New Roman" w:eastAsia="Times New Roman" w:hAnsi="Times New Roman" w:cs="Times New Roman"/>
+          <w:sz w:val="18"/>
+          <w:szCs w:val="18"/>
+        </w:rPr>
+        <w:t xml:space="preserve"> </w:t>
+      </w:r>
+      <w:r>
+        <w:rPr>
+          <w:rFonts w:ascii="Times New Roman" w:eastAsia="Times New Roman" w:hAnsi="Times New Roman" w:cs="Times New Roman"/>
+          <w:sz w:val="18"/>
+          <w:szCs w:val="18"/>
+        </w:rPr>
+        <w:t>As shown in Figure 1,</w:t>
+      </w:r>
+      <w:r>
+        <w:rPr>
+          <w:rFonts w:ascii="Times New Roman" w:eastAsia="Times New Roman" w:hAnsi="Times New Roman" w:cs="Times New Roman"/>
+          <w:b/>
+          <w:bCs/>
+          <w:sz w:val="18"/>
+          <w:szCs w:val="18"/>
+        </w:rPr>
+        <w:t xml:space="preserve"> </w:t>
+      </w:r>
+      <w:r>
+        <w:rPr>
+          <w:rFonts w:ascii="Times New Roman" w:eastAsia="Times New Roman" w:hAnsi="Times New Roman" w:cs="Times New Roman"/>
+          <w:sz w:val="18"/>
+          <w:szCs w:val="18"/>
+        </w:rPr>
+        <w:t>The</w:t>
       </w:r>
       <w:r>
         <w:rPr>
@@ -10923,7 +10957,7 @@
           <w:szCs w:val="18"/>
         </w:rPr>
         <w:drawing>
-          <wp:inline distT="0" distB="0" distL="0" distR="0" wp14:anchorId="52ECD505" wp14:editId="6108B9AC">
+          <wp:inline distT="0" distB="0" distL="0" distR="0" wp14:anchorId="52ECD505" wp14:editId="43B9B590">
             <wp:extent cx="2783039" cy="1552575"/>
             <wp:effectExtent l="0" t="0" r="0" b="0"/>
             <wp:docPr id="2088680804" name="Picture 2"/>
@@ -11357,9 +11391,9 @@
           <w:szCs w:val="18"/>
         </w:rPr>
         <w:drawing>
-          <wp:inline distT="0" distB="0" distL="0" distR="0" wp14:anchorId="44E68CA5" wp14:editId="76717B1D">
-            <wp:extent cx="2762250" cy="1196975"/>
-            <wp:effectExtent l="0" t="0" r="0" b="3175"/>
+          <wp:inline distT="0" distB="0" distL="0" distR="0" wp14:anchorId="44E68CA5" wp14:editId="196525DA">
+            <wp:extent cx="2772905" cy="1201944"/>
+            <wp:effectExtent l="0" t="0" r="0" b="0"/>
             <wp:docPr id="42490669" name="Picture 1"/>
             <wp:cNvGraphicFramePr>
               <a:graphicFrameLocks xmlns:a="http://schemas.openxmlformats.org/drawingml/2006/main" noChangeAspect="1"/>
@@ -11368,7 +11402,7 @@
               <a:graphicData uri="http://schemas.openxmlformats.org/drawingml/2006/picture">
                 <pic:pic xmlns:pic="http://schemas.openxmlformats.org/drawingml/2006/picture">
                   <pic:nvPicPr>
-                    <pic:cNvPr id="42490669" name="Picture 42490669"/>
+                    <pic:cNvPr id="42490669" name="Picture 1"/>
                     <pic:cNvPicPr/>
                   </pic:nvPicPr>
                   <pic:blipFill>
@@ -11386,7 +11420,7 @@
                   <pic:spPr>
                     <a:xfrm>
                       <a:off x="0" y="0"/>
-                      <a:ext cx="2773717" cy="1201944"/>
+                      <a:ext cx="2772905" cy="1201944"/>
                     </a:xfrm>
                     <a:prstGeom prst="rect">
                       <a:avLst/>

</xml_diff>